<commit_message>
feat: align standard table and figure output
</commit_message>
<xml_diff>
--- a/examples/example.docx
+++ b/examples/example.docx
@@ -718,6 +718,7 @@
           <w:cols w:space="425" w:num="1"/>
           <w:titlePg/>
           <w:docGrid w:linePitch="312" w:charSpace="0"/>
+          <w:formProt w:val="0"/>
         </w:sectPr>
       </w:pPr>
       <w:r>
@@ -790,7 +791,6 @@
         <w:pStyle w:val="91"/>
         <w:spacing w:after="360"/>
       </w:pPr>
-      <w:bookmarkStart w:id="19" w:name="BookMark1"/>
       <w:r>
         <w:rPr>
           <w:spacing w:val="320"/>
@@ -805,37 +805,30 @@
       <w:pPr/>
       <w:fldSimple w:instr=" TOC \o &quot;1-3&quot; \h \z \u ">
         <w:r>
-          <w:t>右键此处选择“更新域”以生成目次。</w:t>
+          <w:t>右键此处选择"更新域"以生成目次。</w:t>
         </w:r>
       </w:fldSimple>
     </w:p>
     <w:p>
       <w:pPr>
-        <w:pStyle w:val="91"/>
-        <w:spacing w:after="360"/>
         <w:sectPr>
-          <w:headerReference r:id="rId11" w:type="default"/>
-          <w:footerReference r:id="rId13" w:type="default"/>
-          <w:headerReference r:id="rId12" w:type="even"/>
+          <w:footerReference w:type="default" r:id="rId13"/>
+          <w:headerReference w:type="default" r:id="rId11"/>
+          <w:type w:val="nextPage"/>
           <w:pgSz w:w="11906" w:h="16838"/>
           <w:pgMar w:top="1928" w:right="1134" w:bottom="1134" w:left="1134" w:header="1418" w:footer="1134" w:gutter="284"/>
-          <w:pgNumType w:fmt="upperRoman" w:start="1"/>
           <w:cols w:space="425" w:num="1"/>
           <w:formProt w:val="0"/>
           <w:docGrid w:linePitch="312" w:charSpace="0"/>
+          <w:pgNumType w:fmt="upperRoman" w:start="1"/>
         </w:sectPr>
       </w:pPr>
-      <w:r>
-        <w:fldChar w:fldCharType="end"/>
-      </w:r>
     </w:p>
-    <w:bookmarkEnd w:id="19"/>
     <w:p>
       <w:pPr>
         <w:pStyle w:val="89"/>
         <w:spacing w:after="360"/>
       </w:pPr>
-      <w:bookmarkStart w:id="20" w:name="BookMark2"/>
       <w:r>
         <w:rPr>
           <w:spacing w:val="320"/>
@@ -865,6 +858,10 @@
     <w:p>
       <w:pPr>
         <w:pStyle w:val="92"/>
+        <w:numPr>
+          <w:ilvl w:val="0"/>
+          <w:numId w:val="9"/>
+        </w:numPr>
       </w:pPr>
       <w:r>
         <w:t>更改了智能座舱的分级方法（见第5章，2020年版的第4章）</w:t>
@@ -873,6 +870,10 @@
     <w:p>
       <w:pPr>
         <w:pStyle w:val="92"/>
+        <w:numPr>
+          <w:ilvl w:val="0"/>
+          <w:numId w:val="9"/>
+        </w:numPr>
       </w:pPr>
       <w:r>
         <w:t>增加了综合评价指标（见第6章）</w:t>
@@ -912,25 +913,24 @@
     </w:p>
     <w:p>
       <w:pPr>
-        <w:pStyle w:val="56"/>
-        <w:ind w:firstLine="420"/>
         <w:sectPr>
+          <w:footerReference w:type="default" r:id="rId13"/>
+          <w:headerReference w:type="default" r:id="rId11"/>
+          <w:type w:val="nextPage"/>
           <w:pgSz w:w="11906" w:h="16838"/>
           <w:pgMar w:top="1928" w:right="1134" w:bottom="1134" w:left="1134" w:header="1418" w:footer="1134" w:gutter="284"/>
-          <w:pgNumType w:fmt="upperRoman"/>
           <w:cols w:space="425" w:num="1"/>
           <w:formProt w:val="0"/>
           <w:docGrid w:linePitch="312" w:charSpace="0"/>
+          <w:pgNumType w:fmt="upperRoman"/>
         </w:sectPr>
       </w:pPr>
     </w:p>
-    <w:bookmarkEnd w:id="20"/>
     <w:p>
       <w:pPr>
         <w:pStyle w:val="89"/>
         <w:spacing w:after="360"/>
       </w:pPr>
-      <w:bookmarkStart w:id="21" w:name="BookMark3"/>
       <w:r>
         <w:rPr>
           <w:spacing w:val="320"/>
@@ -959,32 +959,37 @@
     </w:p>
     <w:p>
       <w:pPr>
-        <w:pStyle w:val="56"/>
-        <w:ind w:firstLine="420"/>
         <w:sectPr>
+          <w:footerReference w:type="default" r:id="rId13"/>
+          <w:headerReference w:type="default" r:id="rId11"/>
+          <w:type w:val="nextPage"/>
           <w:pgSz w:w="11906" w:h="16838"/>
           <w:pgMar w:top="1928" w:right="1134" w:bottom="1134" w:left="1134" w:header="1418" w:footer="1134" w:gutter="284"/>
-          <w:pgNumType w:fmt="upperRoman"/>
           <w:cols w:space="425" w:num="1"/>
           <w:formProt w:val="0"/>
           <w:docGrid w:linePitch="312" w:charSpace="0"/>
+          <w:pgNumType w:fmt="upperRoman"/>
         </w:sectPr>
       </w:pPr>
     </w:p>
     <w:p>
       <w:pPr>
-        <w:pStyle w:val="104"/>
-      </w:pPr>
-      <w:r>
-        <w:t>范围</w:t>
+        <w:pStyle w:val="177"/>
+        <w:jc w:val="center"/>
+      </w:pPr>
+      <w:r>
+        <w:rPr>
+          <w:b/>
+        </w:rPr>
+        <w:t>智能座舱分级与综合评价</w:t>
       </w:r>
     </w:p>
     <w:p>
       <w:pPr>
-        <w:pStyle w:val="56"/>
-      </w:pPr>
-      <w:r>
-        <w:t>本文件规定了智能座舱的分级方法、技术要求和综合评价指标。</w:t>
+        <w:pStyle w:val="104"/>
+      </w:pPr>
+      <w:r>
+        <w:t>范围</w:t>
       </w:r>
     </w:p>
     <w:p>
@@ -992,23 +997,23 @@
         <w:pStyle w:val="56"/>
       </w:pPr>
       <w:r>
-        <w:t>本文件适用于乘用车智能座舱的设计、开发与评价。</w:t>
+        <w:t>本文件规定了智能座舱的分级方法、技术要求和综合评价指标。</w:t>
       </w:r>
     </w:p>
     <w:p>
       <w:pPr>
-        <w:pStyle w:val="104"/>
-      </w:pPr>
-      <w:r>
-        <w:t>规范性引用文件</w:t>
+        <w:pStyle w:val="56"/>
+      </w:pPr>
+      <w:r>
+        <w:t>本文件适用于乘用车智能座舱的设计、开发与评价。</w:t>
       </w:r>
     </w:p>
     <w:p>
       <w:pPr>
-        <w:pStyle w:val="56"/>
-      </w:pPr>
-      <w:r>
-        <w:t>下列文件中的内容通过文中的规范性引用而构成本文件必不可少的条款。其中，注日期的引用文件，仅该日期对应的版本适用于本文件；不注日期的引用文件，其最新版本（包括所有的修改单）适用于本文件。</w:t>
+        <w:pStyle w:val="104"/>
+      </w:pPr>
+      <w:r>
+        <w:t>规范性引用文件</w:t>
       </w:r>
     </w:p>
     <w:p>
@@ -1016,79 +1021,122 @@
         <w:pStyle w:val="56"/>
       </w:pPr>
       <w:r>
-        <w:t>GB/T 1.1—2020　标准化工作导则　第1部分：标准化文件的结构和起草规则</w:t>
+        <w:t>下列文件中的内容通过文中的规范性引用而构成本文件必不可少的条款。其中，注日期的引用文件，仅该日期对应的版本适用于本文件；不注日期的引用文件，其最新版本（包括所有的修改单）适用于本文件。</w:t>
       </w:r>
     </w:p>
     <w:p>
       <w:pPr>
-        <w:pStyle w:val="104"/>
-      </w:pPr>
-      <w:r>
-        <w:t>术语和定义</w:t>
+        <w:pStyle w:val="56"/>
+      </w:pPr>
+      <w:bookmarkStart w:id="1000" w:name="Ref_241667a9d08a29af"/>
+      <w:r>
+        <w:t>GB/T 1.1—2020</w:t>
+      </w:r>
+      <w:bookmarkEnd w:id="1000"/>
+      <w:r>
+        <w:t xml:space="preserve">  标准化工作导则　第1部分：标准化文件的结构和起草规则</w:t>
       </w:r>
     </w:p>
     <w:p>
       <w:pPr>
-        <w:pStyle w:val="56"/>
-      </w:pPr>
-      <w:r>
-        <w:t>下列术语和定义适用于本文件。</w:t>
+        <w:pStyle w:val="104"/>
+      </w:pPr>
+      <w:r>
+        <w:t>术语和定义</w:t>
       </w:r>
     </w:p>
     <w:p>
       <w:pPr>
-        <w:pStyle w:val="105"/>
-      </w:pPr>
-      <w:r>
-        <w:t>智能座舱  intelligent cockpit</w:t>
+        <w:pStyle w:val="56"/>
+      </w:pPr>
+      <w:r>
+        <w:t>下列术语和定义适用于本文件。</w:t>
       </w:r>
     </w:p>
     <w:p>
       <w:pPr>
-        <w:pStyle w:val="56"/>
-      </w:pPr>
-      <w:r>
-        <w:t>以驾乘人员为中心，融合多模态交互、场景感知与服务的车内空间系统。</w:t>
+        <w:pStyle w:val="223"/>
+        <w:numPr>
+          <w:ilvl w:val="2"/>
+          <w:numId w:val="2"/>
+        </w:numPr>
+      </w:pPr>
+      <w:r>
+        <w:br/>
+      </w:r>
+      <w:r>
+        <w:rPr>
+          <w:b/>
+        </w:rPr>
+        <w:t>智能座舱</w:t>
+      </w:r>
+      <w:r>
+        <w:t xml:space="preserve">　</w:t>
+      </w:r>
+      <w:r>
+        <w:rPr>
+          <w:b/>
+        </w:rPr>
+        <w:t>intelligent cockpit</w:t>
       </w:r>
     </w:p>
     <w:p>
       <w:pPr>
-        <w:pStyle w:val="105"/>
-      </w:pPr>
-      <w:r>
-        <w:t>多模态交互  multimodal interaction</w:t>
+        <w:pStyle w:val="56"/>
+      </w:pPr>
+      <w:r>
+        <w:t>以驾乘人员为中心，融合多模态交互、场景感知与服务的车内空间系统。</w:t>
       </w:r>
     </w:p>
     <w:p>
       <w:pPr>
-        <w:pStyle w:val="56"/>
-      </w:pPr>
-      <w:r>
-        <w:t>综合运用语音、触控、视觉等多种方式进行人机信息交换的交互形式。</w:t>
+        <w:pStyle w:val="223"/>
+        <w:numPr>
+          <w:ilvl w:val="2"/>
+          <w:numId w:val="2"/>
+        </w:numPr>
+      </w:pPr>
+      <w:r>
+        <w:br/>
+      </w:r>
+      <w:r>
+        <w:rPr>
+          <w:b/>
+        </w:rPr>
+        <w:t>多模态交互</w:t>
+      </w:r>
+      <w:r>
+        <w:t xml:space="preserve">　</w:t>
+      </w:r>
+      <w:r>
+        <w:rPr>
+          <w:b/>
+        </w:rPr>
+        <w:t>multimodal interaction</w:t>
       </w:r>
     </w:p>
     <w:p>
       <w:pPr>
-        <w:pStyle w:val="104"/>
-      </w:pPr>
-      <w:r>
-        <w:t>分级方法</w:t>
+        <w:pStyle w:val="56"/>
+      </w:pPr>
+      <w:r>
+        <w:t>综合运用语音、触控、视觉等多种方式进行人机信息交换的交互形式。</w:t>
       </w:r>
     </w:p>
     <w:p>
       <w:pPr>
-        <w:pStyle w:val="105"/>
-      </w:pPr>
-      <w:r>
-        <w:t>分级原则</w:t>
+        <w:pStyle w:val="104"/>
+      </w:pPr>
+      <w:r>
+        <w:t>分级方法</w:t>
       </w:r>
     </w:p>
     <w:p>
       <w:pPr>
-        <w:pStyle w:val="56"/>
-      </w:pPr>
-      <w:r>
-        <w:t>智能座舱按交互能力、感知能力和服务能力分为 L0 至 L4 共 5 个等级。</w:t>
+        <w:pStyle w:val="105"/>
+      </w:pPr>
+      <w:r>
+        <w:t>分级原则</w:t>
       </w:r>
     </w:p>
     <w:p>
@@ -1096,86 +1144,141 @@
         <w:pStyle w:val="56"/>
       </w:pPr>
       <w:r>
-        <w:t>分级应遵循下列原则：</w:t>
+        <w:t>智能座舱按交互能力、感知能力和服务能力分为 L0 至 L4 共 5 个等级。</w:t>
       </w:r>
     </w:p>
     <w:p>
       <w:pPr>
-        <w:pStyle w:val="92"/>
-      </w:pPr>
-      <w:r>
-        <w:t>以驾乘人员的实际体验为核心；</w:t>
+        <w:pStyle w:val="56"/>
+      </w:pPr>
+      <w:r>
+        <w:t>分级应遵循下列原则：</w:t>
       </w:r>
     </w:p>
     <w:p>
       <w:pPr>
         <w:pStyle w:val="92"/>
-      </w:pPr>
-      <w:r>
-        <w:t>兼顾安全性与可用性；</w:t>
+        <w:numPr>
+          <w:ilvl w:val="0"/>
+          <w:numId w:val="9"/>
+        </w:numPr>
+      </w:pPr>
+      <w:r>
+        <w:t>以驾乘人员的实际体验为核心；</w:t>
       </w:r>
     </w:p>
     <w:p>
       <w:pPr>
         <w:pStyle w:val="92"/>
-      </w:pPr>
-      <w:r>
-        <w:t>可量化、可验证。</w:t>
+        <w:numPr>
+          <w:ilvl w:val="0"/>
+          <w:numId w:val="9"/>
+        </w:numPr>
+      </w:pPr>
+      <w:r>
+        <w:t>兼顾安全性与可用性；</w:t>
       </w:r>
     </w:p>
     <w:p>
       <w:pPr>
-        <w:pStyle w:val="105"/>
-      </w:pPr>
-      <w:r>
-        <w:t>等级划分</w:t>
+        <w:pStyle w:val="92"/>
+        <w:numPr>
+          <w:ilvl w:val="0"/>
+          <w:numId w:val="9"/>
+        </w:numPr>
+      </w:pPr>
+      <w:r>
+        <w:t>可量化、可验证。</w:t>
       </w:r>
     </w:p>
     <w:p>
       <w:pPr>
-        <w:pStyle w:val="56"/>
-      </w:pPr>
-      <w:r>
-        <w:t>各等级的能力要求如下：</w:t>
+        <w:pStyle w:val="105"/>
+      </w:pPr>
+      <w:r>
+        <w:t>等级划分</w:t>
       </w:r>
     </w:p>
     <w:p>
       <w:pPr>
-        <w:pStyle w:val="174"/>
-      </w:pPr>
-      <w:r>
-        <w:t>L0：仅提供基础信息显示；</w:t>
+        <w:pStyle w:val="56"/>
+      </w:pPr>
+      <w:r>
+        <w:t>各等级的能力要求如下：</w:t>
       </w:r>
     </w:p>
     <w:p>
       <w:pPr>
         <w:pStyle w:val="174"/>
-      </w:pPr>
-      <w:r>
-        <w:t>L1：支持单一模态交互；</w:t>
+        <w:numPr>
+          <w:ilvl w:val="0"/>
+          <w:numId w:val="32"/>
+        </w:numPr>
+      </w:pPr>
+      <w:r>
+        <w:t>L0：仅提供基础信息显示；</w:t>
       </w:r>
     </w:p>
     <w:p>
       <w:pPr>
         <w:pStyle w:val="174"/>
-      </w:pPr>
-      <w:r>
-        <w:t>L2：支持多模态交互与基础场景感知。</w:t>
+        <w:numPr>
+          <w:ilvl w:val="0"/>
+          <w:numId w:val="32"/>
+        </w:numPr>
+      </w:pPr>
+      <w:r>
+        <w:t>L1：支持单一模态交互；</w:t>
       </w:r>
     </w:p>
     <w:p>
       <w:pPr>
+        <w:pStyle w:val="174"/>
+        <w:numPr>
+          <w:ilvl w:val="0"/>
+          <w:numId w:val="32"/>
+        </w:numPr>
+      </w:pPr>
+      <w:r>
+        <w:t>L2：支持多模态交互与基础场景感知。</w:t>
+      </w:r>
+    </w:p>
+    <w:p>
+      <w:pPr>
         <w:pStyle w:val="112"/>
-      </w:pPr>
-      <w:r>
-        <w:t>表1　智能座舱分级能力对照</w:t>
-      </w:r>
+        <w:numPr>
+          <w:ilvl w:val="0"/>
+          <w:numId w:val="16"/>
+        </w:numPr>
+      </w:pPr>
+      <w:r>
+        <w:t xml:space="preserve">　</w:t>
+      </w:r>
+      <w:bookmarkStart w:id="1001" w:name="_Ref314611919"/>
+      <w:bookmarkStart w:id="1002" w:name="_Ref371530240"/>
+      <w:bookmarkStart w:id="1003" w:name="_Ref494958920"/>
+      <w:bookmarkStart w:id="1004" w:name="_Ref405096541"/>
+      <w:r>
+        <w:t>智能座舱分级能力对照</w:t>
+      </w:r>
+      <w:bookmarkEnd w:id="1001"/>
+      <w:bookmarkEnd w:id="1002"/>
+      <w:bookmarkEnd w:id="1003"/>
+      <w:bookmarkEnd w:id="1004"/>
     </w:p>
     <w:tbl>
       <w:tblPr>
         <w:tblStyle w:val="27"/>
         <w:tblW w:type="auto" w:w="0"/>
         <w:tblLook w:firstColumn="1" w:firstRow="1" w:lastColumn="0" w:lastRow="0" w:noHBand="0" w:noVBand="1" w:val="04A0"/>
+        <w:tblBorders>
+          <w:top w:val="single" w:sz="8" w:space="0" w:color="000000"/>
+          <w:left w:val="single" w:sz="8" w:space="0" w:color="000000"/>
+          <w:bottom w:val="single" w:sz="8" w:space="0" w:color="000000"/>
+          <w:right w:val="single" w:sz="8" w:space="0" w:color="000000"/>
+          <w:insideH w:val="single" w:sz="4" w:space="0" w:color="000000"/>
+          <w:insideV w:val="single" w:sz="4" w:space="0" w:color="000000"/>
+        </w:tblBorders>
       </w:tblPr>
       <w:tblGrid>
         <w:gridCol w:w="2409"/>
@@ -1184,14 +1287,26 @@
         <w:gridCol w:w="2409"/>
       </w:tblGrid>
       <w:tr>
+        <w:trPr>
+          <w:tblHeader w:val="true"/>
+        </w:trPr>
         <w:tc>
           <w:tcPr>
             <w:tcW w:type="dxa" w:w="2409"/>
+            <w:vAlign w:val="center"/>
+            <w:tcMar>
+              <w:top w:w="60" w:type="dxa"/>
+              <w:left w:w="100" w:type="dxa"/>
+              <w:bottom w:w="60" w:type="dxa"/>
+              <w:right w:w="100" w:type="dxa"/>
+            </w:tcMar>
           </w:tcPr>
           <w:p>
             <w:pPr>
               <w:pStyle w:val="178"/>
+              <w:jc w:val="center"/>
             </w:pPr>
+            <w:r/>
             <w:r>
               <w:t>等级</w:t>
             </w:r>
@@ -1200,11 +1315,20 @@
         <w:tc>
           <w:tcPr>
             <w:tcW w:type="dxa" w:w="2409"/>
+            <w:vAlign w:val="center"/>
+            <w:tcMar>
+              <w:top w:w="60" w:type="dxa"/>
+              <w:left w:w="100" w:type="dxa"/>
+              <w:bottom w:w="60" w:type="dxa"/>
+              <w:right w:w="100" w:type="dxa"/>
+            </w:tcMar>
           </w:tcPr>
           <w:p>
             <w:pPr>
               <w:pStyle w:val="178"/>
+              <w:jc w:val="center"/>
             </w:pPr>
+            <w:r/>
             <w:r>
               <w:t>交互能力</w:t>
             </w:r>
@@ -1213,11 +1337,20 @@
         <w:tc>
           <w:tcPr>
             <w:tcW w:type="dxa" w:w="2409"/>
+            <w:vAlign w:val="center"/>
+            <w:tcMar>
+              <w:top w:w="60" w:type="dxa"/>
+              <w:left w:w="100" w:type="dxa"/>
+              <w:bottom w:w="60" w:type="dxa"/>
+              <w:right w:w="100" w:type="dxa"/>
+            </w:tcMar>
           </w:tcPr>
           <w:p>
             <w:pPr>
               <w:pStyle w:val="178"/>
+              <w:jc w:val="center"/>
             </w:pPr>
+            <w:r/>
             <w:r>
               <w:t>感知能力</w:t>
             </w:r>
@@ -1226,11 +1359,20 @@
         <w:tc>
           <w:tcPr>
             <w:tcW w:type="dxa" w:w="2409"/>
+            <w:vAlign w:val="center"/>
+            <w:tcMar>
+              <w:top w:w="60" w:type="dxa"/>
+              <w:left w:w="100" w:type="dxa"/>
+              <w:bottom w:w="60" w:type="dxa"/>
+              <w:right w:w="100" w:type="dxa"/>
+            </w:tcMar>
           </w:tcPr>
           <w:p>
             <w:pPr>
               <w:pStyle w:val="178"/>
+              <w:jc w:val="center"/>
             </w:pPr>
+            <w:r/>
             <w:r>
               <w:t>服务能力</w:t>
             </w:r>
@@ -1241,11 +1383,20 @@
         <w:tc>
           <w:tcPr>
             <w:tcW w:type="dxa" w:w="2409"/>
+            <w:vAlign w:val="center"/>
+            <w:tcMar>
+              <w:top w:w="60" w:type="dxa"/>
+              <w:left w:w="100" w:type="dxa"/>
+              <w:bottom w:w="60" w:type="dxa"/>
+              <w:right w:w="100" w:type="dxa"/>
+            </w:tcMar>
           </w:tcPr>
           <w:p>
             <w:pPr>
               <w:pStyle w:val="178"/>
+              <w:jc w:val="center"/>
             </w:pPr>
+            <w:r/>
             <w:r>
               <w:t>L0</w:t>
             </w:r>
@@ -1254,11 +1405,20 @@
         <w:tc>
           <w:tcPr>
             <w:tcW w:type="dxa" w:w="2409"/>
+            <w:vAlign w:val="center"/>
+            <w:tcMar>
+              <w:top w:w="60" w:type="dxa"/>
+              <w:left w:w="100" w:type="dxa"/>
+              <w:bottom w:w="60" w:type="dxa"/>
+              <w:right w:w="100" w:type="dxa"/>
+            </w:tcMar>
           </w:tcPr>
           <w:p>
             <w:pPr>
               <w:pStyle w:val="178"/>
+              <w:jc w:val="center"/>
             </w:pPr>
+            <w:r/>
             <w:r>
               <w:t>基础</w:t>
             </w:r>
@@ -1267,11 +1427,20 @@
         <w:tc>
           <w:tcPr>
             <w:tcW w:type="dxa" w:w="2409"/>
+            <w:vAlign w:val="center"/>
+            <w:tcMar>
+              <w:top w:w="60" w:type="dxa"/>
+              <w:left w:w="100" w:type="dxa"/>
+              <w:bottom w:w="60" w:type="dxa"/>
+              <w:right w:w="100" w:type="dxa"/>
+            </w:tcMar>
           </w:tcPr>
           <w:p>
             <w:pPr>
               <w:pStyle w:val="178"/>
+              <w:jc w:val="center"/>
             </w:pPr>
+            <w:r/>
             <w:r>
               <w:t>无</w:t>
             </w:r>
@@ -1280,11 +1449,20 @@
         <w:tc>
           <w:tcPr>
             <w:tcW w:type="dxa" w:w="2409"/>
+            <w:vAlign w:val="center"/>
+            <w:tcMar>
+              <w:top w:w="60" w:type="dxa"/>
+              <w:left w:w="100" w:type="dxa"/>
+              <w:bottom w:w="60" w:type="dxa"/>
+              <w:right w:w="100" w:type="dxa"/>
+            </w:tcMar>
           </w:tcPr>
           <w:p>
             <w:pPr>
               <w:pStyle w:val="178"/>
+              <w:jc w:val="center"/>
             </w:pPr>
+            <w:r/>
             <w:r>
               <w:t>无</w:t>
             </w:r>
@@ -1295,11 +1473,20 @@
         <w:tc>
           <w:tcPr>
             <w:tcW w:type="dxa" w:w="2409"/>
+            <w:vAlign w:val="center"/>
+            <w:tcMar>
+              <w:top w:w="60" w:type="dxa"/>
+              <w:left w:w="100" w:type="dxa"/>
+              <w:bottom w:w="60" w:type="dxa"/>
+              <w:right w:w="100" w:type="dxa"/>
+            </w:tcMar>
           </w:tcPr>
           <w:p>
             <w:pPr>
               <w:pStyle w:val="178"/>
+              <w:jc w:val="center"/>
             </w:pPr>
+            <w:r/>
             <w:r>
               <w:t>L1</w:t>
             </w:r>
@@ -1308,11 +1495,20 @@
         <w:tc>
           <w:tcPr>
             <w:tcW w:type="dxa" w:w="2409"/>
+            <w:vAlign w:val="center"/>
+            <w:tcMar>
+              <w:top w:w="60" w:type="dxa"/>
+              <w:left w:w="100" w:type="dxa"/>
+              <w:bottom w:w="60" w:type="dxa"/>
+              <w:right w:w="100" w:type="dxa"/>
+            </w:tcMar>
           </w:tcPr>
           <w:p>
             <w:pPr>
               <w:pStyle w:val="178"/>
+              <w:jc w:val="center"/>
             </w:pPr>
+            <w:r/>
             <w:r>
               <w:t>单模态</w:t>
             </w:r>
@@ -1321,11 +1517,20 @@
         <w:tc>
           <w:tcPr>
             <w:tcW w:type="dxa" w:w="2409"/>
+            <w:vAlign w:val="center"/>
+            <w:tcMar>
+              <w:top w:w="60" w:type="dxa"/>
+              <w:left w:w="100" w:type="dxa"/>
+              <w:bottom w:w="60" w:type="dxa"/>
+              <w:right w:w="100" w:type="dxa"/>
+            </w:tcMar>
           </w:tcPr>
           <w:p>
             <w:pPr>
               <w:pStyle w:val="178"/>
+              <w:jc w:val="center"/>
             </w:pPr>
+            <w:r/>
             <w:r>
               <w:t>弱</w:t>
             </w:r>
@@ -1334,11 +1539,20 @@
         <w:tc>
           <w:tcPr>
             <w:tcW w:type="dxa" w:w="2409"/>
+            <w:vAlign w:val="center"/>
+            <w:tcMar>
+              <w:top w:w="60" w:type="dxa"/>
+              <w:left w:w="100" w:type="dxa"/>
+              <w:bottom w:w="60" w:type="dxa"/>
+              <w:right w:w="100" w:type="dxa"/>
+            </w:tcMar>
           </w:tcPr>
           <w:p>
             <w:pPr>
               <w:pStyle w:val="178"/>
+              <w:jc w:val="center"/>
             </w:pPr>
+            <w:r/>
             <w:r>
               <w:t>基础</w:t>
             </w:r>
@@ -1349,11 +1563,20 @@
         <w:tc>
           <w:tcPr>
             <w:tcW w:type="dxa" w:w="2409"/>
+            <w:vAlign w:val="center"/>
+            <w:tcMar>
+              <w:top w:w="60" w:type="dxa"/>
+              <w:left w:w="100" w:type="dxa"/>
+              <w:bottom w:w="60" w:type="dxa"/>
+              <w:right w:w="100" w:type="dxa"/>
+            </w:tcMar>
           </w:tcPr>
           <w:p>
             <w:pPr>
               <w:pStyle w:val="178"/>
+              <w:jc w:val="center"/>
             </w:pPr>
+            <w:r/>
             <w:r>
               <w:t>L2</w:t>
             </w:r>
@@ -1362,11 +1585,20 @@
         <w:tc>
           <w:tcPr>
             <w:tcW w:type="dxa" w:w="2409"/>
+            <w:vAlign w:val="center"/>
+            <w:tcMar>
+              <w:top w:w="60" w:type="dxa"/>
+              <w:left w:w="100" w:type="dxa"/>
+              <w:bottom w:w="60" w:type="dxa"/>
+              <w:right w:w="100" w:type="dxa"/>
+            </w:tcMar>
           </w:tcPr>
           <w:p>
             <w:pPr>
               <w:pStyle w:val="178"/>
+              <w:jc w:val="center"/>
             </w:pPr>
+            <w:r/>
             <w:r>
               <w:t>多模态</w:t>
             </w:r>
@@ -1375,11 +1607,20 @@
         <w:tc>
           <w:tcPr>
             <w:tcW w:type="dxa" w:w="2409"/>
+            <w:vAlign w:val="center"/>
+            <w:tcMar>
+              <w:top w:w="60" w:type="dxa"/>
+              <w:left w:w="100" w:type="dxa"/>
+              <w:bottom w:w="60" w:type="dxa"/>
+              <w:right w:w="100" w:type="dxa"/>
+            </w:tcMar>
           </w:tcPr>
           <w:p>
             <w:pPr>
               <w:pStyle w:val="178"/>
+              <w:jc w:val="center"/>
             </w:pPr>
+            <w:r/>
             <w:r>
               <w:t>中</w:t>
             </w:r>
@@ -1388,56 +1629,81 @@
         <w:tc>
           <w:tcPr>
             <w:tcW w:type="dxa" w:w="2409"/>
+            <w:vAlign w:val="center"/>
+            <w:tcMar>
+              <w:top w:w="60" w:type="dxa"/>
+              <w:left w:w="100" w:type="dxa"/>
+              <w:bottom w:w="60" w:type="dxa"/>
+              <w:right w:w="100" w:type="dxa"/>
+            </w:tcMar>
           </w:tcPr>
           <w:p>
             <w:pPr>
               <w:pStyle w:val="178"/>
+              <w:jc w:val="center"/>
             </w:pPr>
+            <w:r/>
             <w:r>
               <w:t>进阶</w:t>
             </w:r>
           </w:p>
         </w:tc>
       </w:tr>
+      <w:tr>
+        <w:tc>
+          <w:tcPr>
+            <w:tcW w:type="dxa" w:w="9636"/>
+            <w:gridSpan w:val="4"/>
+            <w:vAlign w:val="center"/>
+            <w:tcMar>
+              <w:top w:w="60" w:type="dxa"/>
+              <w:left w:w="100" w:type="dxa"/>
+              <w:bottom w:w="60" w:type="dxa"/>
+              <w:right w:w="100" w:type="dxa"/>
+            </w:tcMar>
+          </w:tcPr>
+          <w:p>
+            <w:pPr>
+              <w:pStyle w:val="179"/>
+            </w:pPr>
+            <w:r/>
+            <w:r>
+              <w:t>上表中的能力等级仅用于示意，具体指标见第6章。</w:t>
+            </w:r>
+          </w:p>
+        </w:tc>
+      </w:tr>
     </w:tbl>
     <w:p>
       <w:pPr>
-        <w:pStyle w:val="179"/>
-      </w:pPr>
-      <w:r>
-        <w:t>注：上表中的能力等级仅用于示意，具体指标见第6章。</w:t>
+        <w:pStyle w:val="104"/>
+      </w:pPr>
+      <w:r>
+        <w:t>综合评价</w:t>
       </w:r>
     </w:p>
     <w:p>
       <w:pPr>
-        <w:pStyle w:val="104"/>
-      </w:pPr>
-      <w:r>
-        <w:t>综合评价</w:t>
+        <w:pStyle w:val="105"/>
+      </w:pPr>
+      <w:r>
+        <w:t>评价指标</w:t>
       </w:r>
     </w:p>
     <w:p>
       <w:pPr>
-        <w:pStyle w:val="105"/>
-      </w:pPr>
-      <w:r>
-        <w:t>评价指标</w:t>
+        <w:pStyle w:val="56"/>
+      </w:pPr>
+      <w:r>
+        <w:t>综合评价包括交互效率、场景适应性和用户满意度三个维度。</w:t>
       </w:r>
     </w:p>
     <w:p>
       <w:pPr>
-        <w:pStyle w:val="56"/>
-      </w:pPr>
-      <w:r>
-        <w:t>综合评价包括交互效率、场景适应性和用户满意度三个维度。</w:t>
-      </w:r>
-    </w:p>
-    <w:p>
-      <w:pPr>
         <w:pStyle w:val="181"/>
       </w:pPr>
       <w:r>
-        <w:t>示例：交互效率可用任务完成时间与操作步数综合衡量。</w:t>
+        <w:t>交互效率可用任务完成时间与操作步数综合衡量。</w:t>
       </w:r>
     </w:p>
     <w:p>
@@ -1476,157 +1742,130 @@
     </w:p>
     <w:p>
       <w:pPr>
-        <w:pStyle w:val="76"/>
-      </w:pPr>
-    </w:p>
-    <w:p>
-      <w:pPr>
-        <w:pStyle w:val="134"/>
-      </w:pPr>
-      <w:r>
-        <w:t>（规范性）</w:t>
-      </w:r>
-    </w:p>
-    <w:p>
-      <w:pPr>
-        <w:pStyle w:val="87"/>
-      </w:pPr>
-      <w:r>
-        <w:t>分级判定流程</w:t>
-      </w:r>
-    </w:p>
-    <w:p>
-      <w:pPr>
-        <w:pStyle w:val="78"/>
-      </w:pPr>
-      <w:r>
-        <w:t>判定步骤</w:t>
-      </w:r>
-    </w:p>
-    <w:p>
-      <w:pPr>
-        <w:pStyle w:val="56"/>
-      </w:pPr>
-      <w:r>
-        <w:t>按下列步骤进行分级判定：</w:t>
-      </w:r>
-    </w:p>
-    <w:p>
-      <w:pPr>
-        <w:pStyle w:val="92"/>
-      </w:pPr>
-      <w:r>
-        <w:t>确定座舱具备的交互模态数量；</w:t>
-      </w:r>
-    </w:p>
-    <w:p>
-      <w:pPr>
-        <w:pStyle w:val="92"/>
-      </w:pPr>
-      <w:r>
-        <w:t>评估场景感知与服务能力；</w:t>
-      </w:r>
-    </w:p>
-    <w:p>
-      <w:pPr>
-        <w:pStyle w:val="92"/>
-      </w:pPr>
-      <w:r>
-        <w:t>综合得出等级。</w:t>
-      </w:r>
-    </w:p>
-    <w:p>
-      <w:pPr>
-        <w:pStyle w:val="76"/>
-      </w:pPr>
-    </w:p>
-    <w:p>
-      <w:pPr>
-        <w:pStyle w:val="134"/>
-      </w:pPr>
-      <w:r>
-        <w:t>（资料性）</w:t>
-      </w:r>
-    </w:p>
-    <w:p>
-      <w:pPr>
-        <w:pStyle w:val="87"/>
-      </w:pPr>
-      <w:r>
-        <w:t>评价指标计算示例</w:t>
-      </w:r>
-    </w:p>
-    <w:p>
-      <w:pPr>
-        <w:pStyle w:val="78"/>
-      </w:pPr>
-      <w:r>
-        <w:t>交互效率计算</w:t>
-      </w:r>
-    </w:p>
-    <w:p>
-      <w:pPr>
-        <w:pStyle w:val="56"/>
-      </w:pPr>
-      <w:r>
-        <w:t>交互效率得分按相关公式计算，具体方法参见相关文献。</w:t>
-      </w:r>
-    </w:p>
-    <w:p>
-      <w:pPr>
-        <w:pStyle w:val="56"/>
-        <w:ind w:firstLine="420"/>
         <w:sectPr>
+          <w:footerReference w:type="default" r:id="rId13"/>
+          <w:headerReference w:type="default" r:id="rId11"/>
+          <w:type w:val="nextPage"/>
           <w:pgSz w:w="11906" w:h="16838"/>
           <w:pgMar w:top="1928" w:right="1134" w:bottom="1134" w:left="1134" w:header="1418" w:footer="1134" w:gutter="284"/>
-          <w:pgNumType w:start="1"/>
           <w:cols w:space="425" w:num="1"/>
           <w:formProt w:val="0"/>
           <w:docGrid w:linePitch="312" w:charSpace="0"/>
+          <w:pgNumType w:start="1"/>
         </w:sectPr>
       </w:pPr>
-      <w:bookmarkStart w:id="47" w:name="BookMark6"/>
     </w:p>
     <w:p>
       <w:pPr>
-        <w:pStyle w:val="63"/>
-        <w:spacing w:after="120"/>
-      </w:pPr>
+        <w:pStyle w:val="76"/>
+        <w:pageBreakBefore w:val="0"/>
+      </w:pPr>
+      <w:r>
+        <w:br/>
+      </w:r>
       <w:r>
         <w:rPr>
-          <w:rFonts w:hint="eastAsia"/>
-          <w:spacing w:val="105"/>
+          <w:rFonts w:ascii="黑体" w:eastAsia="黑体"/>
         </w:rPr>
-        <w:t>参考文</w:t>
+        <w:t>（规范性）</w:t>
+      </w:r>
+      <w:r>
+        <w:br/>
       </w:r>
       <w:r>
         <w:rPr>
-          <w:rFonts w:hint="eastAsia"/>
+          <w:rFonts w:ascii="黑体" w:hAnsi="Times New Roman" w:eastAsia="黑体" w:cs="Times New Roman"/>
+          <w:kern w:val="21"/>
+          <w:sz w:val="21"/>
+          <w:lang w:val="en-US" w:eastAsia="zh-CN" w:bidi="ar-SA"/>
         </w:rPr>
-        <w:t>献</w:t>
+        <w:t>分级判定流程</w:t>
       </w:r>
     </w:p>
     <w:p>
       <w:pPr>
-        <w:pStyle w:val="64"/>
-      </w:pPr>
-      <w:r>
-        <w:t>GB/T 1.1—2020　标准化工作导则　第1部分：标准化文件的结构和起草规则</w:t>
-      </w:r>
+        <w:pStyle w:val="199"/>
+        <w:numPr>
+          <w:ilvl w:val="0"/>
+          <w:numId w:val="5"/>
+        </w:numPr>
+        <w:rPr>
+          <w:vanish/>
+        </w:rPr>
+        <w:spacing w:before="0" w:after="0" w:line="1" w:lineRule="exact"/>
+      </w:pPr>
     </w:p>
     <w:p>
       <w:pPr>
-        <w:pStyle w:val="64"/>
-      </w:pPr>
-      <w:r>
-        <w:t>ISO 11783　Tractors and machinery for agriculture and forestry</w:t>
-      </w:r>
+        <w:pStyle w:val="198"/>
+        <w:numPr>
+          <w:ilvl w:val="0"/>
+          <w:numId w:val="6"/>
+        </w:numPr>
+        <w:rPr>
+          <w:vanish/>
+        </w:rPr>
+        <w:spacing w:before="0" w:after="0" w:line="1" w:lineRule="exact"/>
+      </w:pPr>
     </w:p>
     <w:p>
       <w:pPr>
+        <w:pStyle w:val="78"/>
+      </w:pPr>
+      <w:r>
+        <w:t>判定步骤</w:t>
+      </w:r>
+    </w:p>
+    <w:p>
+      <w:pPr>
         <w:pStyle w:val="56"/>
-        <w:ind w:firstLine="420"/>
+      </w:pPr>
+      <w:r>
+        <w:t>按下列步骤进行分级判定：</w:t>
+      </w:r>
+    </w:p>
+    <w:p>
+      <w:pPr>
+        <w:pStyle w:val="92"/>
+        <w:numPr>
+          <w:ilvl w:val="0"/>
+          <w:numId w:val="9"/>
+        </w:numPr>
+      </w:pPr>
+      <w:r>
+        <w:t>确定座舱具备的交互模态数量；</w:t>
+      </w:r>
+    </w:p>
+    <w:p>
+      <w:pPr>
+        <w:pStyle w:val="92"/>
+        <w:numPr>
+          <w:ilvl w:val="0"/>
+          <w:numId w:val="9"/>
+        </w:numPr>
+      </w:pPr>
+      <w:r>
+        <w:t>评估场景感知与服务能力；</w:t>
+      </w:r>
+    </w:p>
+    <w:p>
+      <w:pPr>
+        <w:pStyle w:val="92"/>
+        <w:numPr>
+          <w:ilvl w:val="0"/>
+          <w:numId w:val="9"/>
+        </w:numPr>
+      </w:pPr>
+      <w:r>
+        <w:t>综合得出等级。</w:t>
+      </w:r>
+    </w:p>
+    <w:p>
+      <w:pPr>
         <w:sectPr>
+          <w:footerReference w:type="default" r:id="rId13"/>
+          <w:headerReference w:type="default" r:id="rId11"/>
+          <w:type w:val="nextPage"/>
           <w:pgSz w:w="11906" w:h="16838"/>
           <w:pgMar w:top="1928" w:right="1134" w:bottom="1134" w:left="1134" w:header="1418" w:footer="1134" w:gutter="284"/>
           <w:cols w:space="425" w:num="1"/>
@@ -1634,38 +1873,147 @@
           <w:docGrid w:linePitch="312" w:charSpace="0"/>
         </w:sectPr>
       </w:pPr>
-      <w:bookmarkStart w:id="48" w:name="BookMark7"/>
     </w:p>
-    <w:bookmarkEnd w:id="48"/>
     <w:p>
       <w:pPr>
+        <w:pStyle w:val="76"/>
+        <w:pageBreakBefore w:val="0"/>
+      </w:pPr>
+      <w:r>
+        <w:br/>
+      </w:r>
+      <w:r>
+        <w:rPr>
+          <w:rFonts w:ascii="黑体" w:eastAsia="黑体"/>
+        </w:rPr>
+        <w:t>（资料性）</w:t>
+      </w:r>
+      <w:r>
+        <w:br/>
+      </w:r>
+      <w:r>
+        <w:rPr>
+          <w:rFonts w:ascii="黑体" w:hAnsi="Times New Roman" w:eastAsia="黑体" w:cs="Times New Roman"/>
+          <w:kern w:val="21"/>
+          <w:sz w:val="21"/>
+          <w:lang w:val="en-US" w:eastAsia="zh-CN" w:bidi="ar-SA"/>
+        </w:rPr>
+        <w:t>评价指标计算示例</w:t>
+      </w:r>
+    </w:p>
+    <w:p>
+      <w:pPr>
+        <w:pStyle w:val="199"/>
+        <w:numPr>
+          <w:ilvl w:val="0"/>
+          <w:numId w:val="5"/>
+        </w:numPr>
+        <w:rPr>
+          <w:vanish/>
+        </w:rPr>
+        <w:spacing w:before="0" w:after="0" w:line="1" w:lineRule="exact"/>
+      </w:pPr>
+    </w:p>
+    <w:p>
+      <w:pPr>
+        <w:pStyle w:val="198"/>
+        <w:numPr>
+          <w:ilvl w:val="0"/>
+          <w:numId w:val="6"/>
+        </w:numPr>
+        <w:rPr>
+          <w:vanish/>
+        </w:rPr>
+        <w:spacing w:before="0" w:after="0" w:line="1" w:lineRule="exact"/>
+      </w:pPr>
+    </w:p>
+    <w:p>
+      <w:pPr>
+        <w:pStyle w:val="78"/>
+      </w:pPr>
+      <w:r>
+        <w:t>交互效率计算</w:t>
+      </w:r>
+    </w:p>
+    <w:p>
+      <w:pPr>
         <w:pStyle w:val="56"/>
-        <w:ind w:firstLine="0" w:firstLineChars="0"/>
+      </w:pPr>
+      <w:r>
+        <w:t>交互效率得分按相关公式计算，具体方法参见相关文献。</w:t>
+      </w:r>
+    </w:p>
+    <w:p>
+      <w:pPr>
+        <w:sectPr>
+          <w:footerReference w:type="default" r:id="rId13"/>
+          <w:headerReference w:type="default" r:id="rId11"/>
+          <w:type w:val="nextPage"/>
+          <w:pgSz w:w="11906" w:h="16838"/>
+          <w:pgMar w:top="1928" w:right="1134" w:bottom="1134" w:left="1134" w:header="1418" w:footer="1134" w:gutter="284"/>
+          <w:cols w:space="425" w:num="1"/>
+          <w:formProt w:val="0"/>
+          <w:docGrid w:linePitch="312" w:charSpace="0"/>
+        </w:sectPr>
+      </w:pPr>
+    </w:p>
+    <w:p>
+      <w:pPr>
+        <w:pStyle w:val="63"/>
+        <w:spacing w:after="120"/>
+      </w:pPr>
+      <w:r>
+        <w:rPr>
+          <w:rFonts w:hint="eastAsia"/>
+          <w:spacing w:val="105"/>
+        </w:rPr>
+        <w:t>参考文</w:t>
+      </w:r>
+      <w:r>
+        <w:rPr>
+          <w:rFonts w:hint="eastAsia"/>
+        </w:rPr>
+        <w:t>献</w:t>
+      </w:r>
+    </w:p>
+    <w:p>
+      <w:pPr>
+        <w:pStyle w:val="64"/>
+      </w:pPr>
+      <w:r>
+        <w:t>GB/T 1.1—2020　标准化工作导则　第1部分：标准化文件的结构和起草规则</w:t>
+      </w:r>
+    </w:p>
+    <w:p>
+      <w:pPr>
+        <w:pStyle w:val="64"/>
+      </w:pPr>
+      <w:r>
+        <w:t>ISO 11783　Tractors and machinery for agriculture and forestry</w:t>
+      </w:r>
+    </w:p>
+    <w:p>
+      <w:pPr>
+        <w:pStyle w:val="56"/>
         <w:jc w:val="center"/>
       </w:pPr>
-      <w:bookmarkStart w:id="49" w:name="BookMark8"/>
       <w:r>
         <w:drawing>
-          <wp:inline distT="0" distB="0" distL="0" distR="0">
+          <wp:inline xmlns:a="http://schemas.openxmlformats.org/drawingml/2006/main" xmlns:pic="http://schemas.openxmlformats.org/drawingml/2006/picture">
             <wp:extent cx="1485900" cy="317500"/>
-            <wp:effectExtent l="0" t="0" r="0" b="6350"/>
-            <wp:docPr id="3" name="图片 3"/>
-            <wp:cNvGraphicFramePr/>
-            <a:graphic xmlns:a="http://schemas.openxmlformats.org/drawingml/2006/main">
+            <wp:docPr id="74" name="Picture 74"/>
+            <wp:cNvGraphicFramePr>
+              <a:graphicFrameLocks noChangeAspect="1"/>
+            </wp:cNvGraphicFramePr>
+            <a:graphic>
               <a:graphicData uri="http://schemas.openxmlformats.org/drawingml/2006/picture">
-                <pic:pic xmlns:pic="http://schemas.openxmlformats.org/drawingml/2006/picture">
+                <pic:pic>
                   <pic:nvPicPr>
-                    <pic:cNvPr id="3" name="图片 3"/>
+                    <pic:cNvPr id="0" name="image.jpg"/>
                     <pic:cNvPicPr/>
                   </pic:nvPicPr>
                   <pic:blipFill>
-                    <a:blip r:embed="rId15">
-                      <a:extLst>
-                        <a:ext uri="{28A0092B-C50C-407E-A947-70E740481C1C}">
-                          <a14:useLocalDpi xmlns:a14="http://schemas.microsoft.com/office/drawing/2010/main" val="0"/>
-                        </a:ext>
-                      </a:extLst>
-                    </a:blip>
+                    <a:blip r:embed="rId15"/>
                     <a:stretch>
                       <a:fillRect/>
                     </a:stretch>
@@ -1675,9 +2023,7 @@
                       <a:off x="0" y="0"/>
                       <a:ext cx="1485900" cy="317500"/>
                     </a:xfrm>
-                    <a:prstGeom prst="rect">
-                      <a:avLst/>
-                    </a:prstGeom>
+                    <a:prstGeom prst="rect"/>
                   </pic:spPr>
                 </pic:pic>
               </a:graphicData>
@@ -1685,9 +2031,11 @@
           </wp:inline>
         </w:drawing>
       </w:r>
-      <w:bookmarkEnd w:id="49"/>
     </w:p>
     <w:sectPr>
+      <w:footerReference w:type="default" r:id="rId13"/>
+      <w:headerReference w:type="default" r:id="rId11"/>
+      <w:type w:val="nextPage"/>
       <w:pgSz w:w="11906" w:h="16838"/>
       <w:pgMar w:top="1928" w:right="1134" w:bottom="1134" w:left="1134" w:header="1418" w:footer="1134" w:gutter="284"/>
       <w:cols w:space="425" w:num="1"/>
@@ -1737,7 +2085,7 @@
 <w:ftr xmlns:wpc="http://schemas.microsoft.com/office/word/2010/wordprocessingCanvas" xmlns:mc="http://schemas.openxmlformats.org/markup-compatibility/2006" xmlns:o="urn:schemas-microsoft-com:office:office" xmlns:r="http://schemas.openxmlformats.org/officeDocument/2006/relationships" xmlns:m="http://schemas.openxmlformats.org/officeDocument/2006/math" xmlns:v="urn:schemas-microsoft-com:vml" xmlns:wp14="http://schemas.microsoft.com/office/word/2010/wordprocessingDrawing" xmlns:wp="http://schemas.openxmlformats.org/drawingml/2006/wordprocessingDrawing" xmlns:w10="urn:schemas-microsoft-com:office:word" xmlns:w="http://schemas.openxmlformats.org/wordprocessingml/2006/main" xmlns:w14="http://schemas.microsoft.com/office/word/2010/wordml" xmlns:w15="http://schemas.microsoft.com/office/word/2012/wordml" xmlns:wpg="http://schemas.microsoft.com/office/word/2010/wordprocessingGroup" xmlns:wpi="http://schemas.microsoft.com/office/word/2010/wordprocessingInk" xmlns:wne="http://schemas.microsoft.com/office/word/2006/wordml" xmlns:wps="http://schemas.microsoft.com/office/word/2010/wordprocessingShape" xmlns:wpsCustomData="http://www.wps.cn/officeDocument/2013/wpsCustomData" mc:Ignorable="w14 w15 wp14">
   <w:p>
     <w:pPr>
-      <w:pStyle w:val="17"/>
+      <w:pStyle w:val="51"/>
     </w:pPr>
     <w:r>
       <w:fldChar w:fldCharType="begin"/>
@@ -1919,8 +2267,7 @@
 <w:hdr xmlns:wpc="http://schemas.microsoft.com/office/word/2010/wordprocessingCanvas" xmlns:mc="http://schemas.openxmlformats.org/markup-compatibility/2006" xmlns:o="urn:schemas-microsoft-com:office:office" xmlns:r="http://schemas.openxmlformats.org/officeDocument/2006/relationships" xmlns:m="http://schemas.openxmlformats.org/officeDocument/2006/math" xmlns:v="urn:schemas-microsoft-com:vml" xmlns:wp14="http://schemas.microsoft.com/office/word/2010/wordprocessingDrawing" xmlns:wp="http://schemas.openxmlformats.org/drawingml/2006/wordprocessingDrawing" xmlns:w10="urn:schemas-microsoft-com:office:word" xmlns:w="http://schemas.openxmlformats.org/wordprocessingml/2006/main" xmlns:w14="http://schemas.microsoft.com/office/word/2010/wordml" xmlns:w15="http://schemas.microsoft.com/office/word/2012/wordml" xmlns:wpg="http://schemas.microsoft.com/office/word/2010/wordprocessingGroup" xmlns:wpi="http://schemas.microsoft.com/office/word/2010/wordprocessingInk" xmlns:wne="http://schemas.microsoft.com/office/word/2006/wordml" xmlns:wps="http://schemas.microsoft.com/office/word/2010/wordprocessingShape" xmlns:wpsCustomData="http://www.wps.cn/officeDocument/2013/wpsCustomData" mc:Ignorable="w14 w15 wp14">
   <w:p>
     <w:pPr>
-      <w:pStyle w:val="18"/>
-      <w:jc w:val="right"/>
+      <w:pStyle w:val="62"/>
     </w:pPr>
     <w:r>
       <w:fldChar w:fldCharType="begin"/>
@@ -1957,7 +2304,7 @@
         <w:tabs>
           <w:tab w:val="left" w:pos="1646"/>
         </w:tabs>
-        <w:ind w:left="1646" w:hanging="648"/>
+        <w:ind w:left="620" w:hanging="420"/>
       </w:pPr>
     </w:lvl>
     <w:lvl w:ilvl="1" w:tentative="0">
@@ -3064,7 +3411,7 @@
       <w:lvlText w:val="——"/>
       <w:lvlJc w:val="left"/>
       <w:pPr>
-        <w:ind w:left="794" w:hanging="397"/>
+        <w:ind w:left="600" w:hanging="200"/>
       </w:pPr>
     </w:lvl>
     <w:lvl w:ilvl="1" w:tentative="0">
@@ -3925,7 +4272,7 @@
       <w:lvlText w:val="——"/>
       <w:lvlJc w:val="left"/>
       <w:pPr>
-        <w:ind w:left="1588" w:firstLine="0"/>
+        <w:ind w:left="920" w:hanging="200"/>
       </w:pPr>
     </w:lvl>
     <w:lvl w:ilvl="1" w:tentative="0">
@@ -4496,7 +4843,7 @@
       <w:numFmt w:val="decimal"/>
       <w:pStyle w:val="112"/>
       <w:suff w:val="nothing"/>
-      <w:lvlText w:val="表%1　"/>
+      <w:lvlText w:val="表%1"/>
       <w:lvlJc w:val="left"/>
       <w:pPr>
         <w:ind w:left="0" w:firstLine="0"/>
@@ -5808,6 +6155,36 @@
   </w:num>
   <w:num w:numId="31">
     <w:abstractNumId w:val="22"/>
+  </w:num>
+  <w:num w:numId="32">
+    <w:abstractNumId w:val="12"/>
+    <w:lvlOverride w:ilvl="0">
+      <w:startOverride w:val="1"/>
+    </w:lvlOverride>
+    <w:lvlOverride w:ilvl="1">
+      <w:startOverride w:val="1"/>
+    </w:lvlOverride>
+    <w:lvlOverride w:ilvl="2">
+      <w:startOverride w:val="1"/>
+    </w:lvlOverride>
+    <w:lvlOverride w:ilvl="3">
+      <w:startOverride w:val="1"/>
+    </w:lvlOverride>
+    <w:lvlOverride w:ilvl="4">
+      <w:startOverride w:val="1"/>
+    </w:lvlOverride>
+    <w:lvlOverride w:ilvl="5">
+      <w:startOverride w:val="1"/>
+    </w:lvlOverride>
+    <w:lvlOverride w:ilvl="6">
+      <w:startOverride w:val="1"/>
+    </w:lvlOverride>
+    <w:lvlOverride w:ilvl="7">
+      <w:startOverride w:val="1"/>
+    </w:lvlOverride>
+    <w:lvlOverride w:ilvl="8">
+      <w:startOverride w:val="1"/>
+    </w:lvlOverride>
   </w:num>
 </w:numbering>
 </file>
@@ -7462,7 +7839,6 @@
       </w:numPr>
       <w:adjustRightInd w:val="0"/>
       <w:snapToGrid w:val="0"/>
-      <w:ind w:firstLine="200" w:firstLineChars="200"/>
     </w:pPr>
     <w:rPr>
       <w:rFonts w:ascii="Times New Roman" w:hAnsi="Times New Roman" w:eastAsia="宋体" w:cs="Times New Roman"/>

</xml_diff>

<commit_message>
fix: thicken table header bottom borders
</commit_message>
<xml_diff>
--- a/examples/example.docx
+++ b/examples/example.docx
@@ -1300,6 +1300,9 @@
               <w:bottom w:w="60" w:type="dxa"/>
               <w:right w:w="100" w:type="dxa"/>
             </w:tcMar>
+            <w:tcBorders>
+              <w:bottom w:val="single" w:sz="8" w:space="0" w:color="000000"/>
+            </w:tcBorders>
           </w:tcPr>
           <w:p>
             <w:pPr>
@@ -1322,6 +1325,9 @@
               <w:bottom w:w="60" w:type="dxa"/>
               <w:right w:w="100" w:type="dxa"/>
             </w:tcMar>
+            <w:tcBorders>
+              <w:bottom w:val="single" w:sz="8" w:space="0" w:color="000000"/>
+            </w:tcBorders>
           </w:tcPr>
           <w:p>
             <w:pPr>
@@ -1344,6 +1350,9 @@
               <w:bottom w:w="60" w:type="dxa"/>
               <w:right w:w="100" w:type="dxa"/>
             </w:tcMar>
+            <w:tcBorders>
+              <w:bottom w:val="single" w:sz="8" w:space="0" w:color="000000"/>
+            </w:tcBorders>
           </w:tcPr>
           <w:p>
             <w:pPr>
@@ -1366,6 +1375,9 @@
               <w:bottom w:w="60" w:type="dxa"/>
               <w:right w:w="100" w:type="dxa"/>
             </w:tcMar>
+            <w:tcBorders>
+              <w:bottom w:val="single" w:sz="8" w:space="0" w:color="000000"/>
+            </w:tcBorders>
           </w:tcPr>
           <w:p>
             <w:pPr>

</xml_diff>

<commit_message>
fix: align term layout and clause marker validation
</commit_message>
<xml_diff>
--- a/examples/example.docx
+++ b/examples/example.docx
@@ -1061,9 +1061,11 @@
           <w:numId w:val="2"/>
         </w:numPr>
       </w:pPr>
-      <w:r>
-        <w:br/>
-      </w:r>
+    </w:p>
+    <w:p>
+      <w:pPr>
+        <w:pStyle w:val="56"/>
+      </w:pPr>
       <w:r>
         <w:rPr>
           <w:b/>
@@ -1096,9 +1098,11 @@
           <w:numId w:val="2"/>
         </w:numPr>
       </w:pPr>
-      <w:r>
-        <w:br/>
-      </w:r>
+    </w:p>
+    <w:p>
+      <w:pPr>
+        <w:pStyle w:val="56"/>
+      </w:pPr>
       <w:r>
         <w:rPr>
           <w:b/>

</xml_diff>

<commit_message>
fix: preserve template formatting in generated docs
</commit_message>
<xml_diff>
--- a/examples/example.docx
+++ b/examples/example.docx
@@ -60,7 +60,7 @@
             </w:pPr>
             <w:r>
               <w:rPr>
-                <w:rFonts w:ascii="Times New Roman" w:hAnsi="Times New Roman" w:eastAsia="黑体"/>
+                <w:rFonts w:ascii="Times New Roman" w:hAnsi="Times New Roman" w:eastAsia="黑体" w:hint="eastAsia"/>
                 <w:sz w:val="21"/>
                 <w:szCs w:val="21"/>
               </w:rPr>
@@ -68,7 +68,7 @@
             </w:r>
             <w:r>
               <w:rPr>
-                <w:rFonts w:ascii="黑体" w:hAnsi="黑体" w:eastAsia="黑体"/>
+                <w:rFonts w:ascii="黑体" w:hAnsi="黑体" w:eastAsia="黑体" w:hint="eastAsia"/>
                 <w:sz w:val="21"/>
                 <w:szCs w:val="21"/>
               </w:rPr>
@@ -98,7 +98,7 @@
             </w:pPr>
             <w:r>
               <w:rPr>
-                <w:rFonts w:ascii="黑体" w:hAnsi="黑体" w:eastAsia="黑体"/>
+                <w:rFonts w:ascii="黑体" w:hAnsi="黑体" w:eastAsia="黑体" w:hint="eastAsia"/>
                 <w:sz w:val="21"/>
                 <w:szCs w:val="21"/>
               </w:rPr>
@@ -148,7 +148,7 @@
             </w:pPr>
             <w:r>
               <w:rPr>
-                <w:rFonts w:ascii="Times New Roman" w:hAnsi="Times New Roman" w:eastAsia="黑体"/>
+                <w:rFonts w:ascii="Times New Roman" w:hAnsi="Times New Roman" w:eastAsia="黑体" w:hint="eastAsia"/>
                 <w:sz w:val="21"/>
                 <w:szCs w:val="21"/>
               </w:rPr>
@@ -156,7 +156,7 @@
             </w:r>
             <w:r>
               <w:rPr>
-                <w:rFonts w:ascii="黑体" w:hAnsi="黑体" w:eastAsia="黑体"/>
+                <w:rFonts w:ascii="黑体" w:hAnsi="黑体" w:eastAsia="黑体" w:hint="eastAsia"/>
                 <w:sz w:val="21"/>
                 <w:szCs w:val="21"/>
               </w:rPr>
@@ -234,6 +234,7 @@
                     <w:rPr>
                       <w:sz w:val="21"/>
                       <w:szCs w:val="21"/>
+                      <w:rFonts w:hint="eastAsia"/>
                     </w:rPr>
                     <w:t xml:space="preserve"> </w:t>
                   </w:r>
@@ -259,7 +260,7 @@
             </w:pPr>
             <w:r>
               <w:rPr>
-                <w:rFonts w:ascii="黑体" w:hAnsi="黑体" w:eastAsia="黑体"/>
+                <w:rFonts w:ascii="黑体" w:hAnsi="黑体" w:eastAsia="黑体" w:hint="eastAsia"/>
                 <w:sz w:val="21"/>
                 <w:szCs w:val="21"/>
               </w:rPr>
@@ -302,6 +303,9 @@
         <w:framePr/>
       </w:pPr>
       <w:r>
+        <w:rPr>
+          <w:rFonts w:hint="eastAsia"/>
+        </w:rPr>
         <w:t>T/CCF 001—2024</w:t>
       </w:r>
       <w:bookmarkStart w:id="3" w:name="文字1"/>
@@ -321,7 +325,7 @@
       </w:pPr>
       <w:r>
         <w:rPr>
-          <w:rFonts w:hAnsi="黑体"/>
+          <w:rFonts w:hAnsi="黑体" w:hint="eastAsia"/>
         </w:rPr>
         <w:t>代替 T/CCF 001—2020</w:t>
       </w:r>
@@ -422,6 +426,9 @@
         <w:framePr w:h="6974" w:hRule="exact" w:wrap="around" w:x="1419" w:anchorLock="1"/>
       </w:pPr>
       <w:r>
+        <w:rPr>
+          <w:rFonts w:hint="eastAsia"/>
+        </w:rPr>
         <w:t>智能座舱分级与综合评价</w:t>
       </w:r>
       <w:bookmarkStart w:id="7" w:name="CSTD_NAME"/>
@@ -445,7 +452,7 @@
       </w:pPr>
       <w:r>
         <w:rPr>
-          <w:rFonts w:eastAsia="黑体"/>
+          <w:rFonts w:eastAsia="黑体" w:hint="eastAsia"/>
           <w:szCs w:val="28"/>
         </w:rPr>
         <w:t>Classification and comprehensive evaluation of intelligent cockpit</w:t>
@@ -573,6 +580,7 @@
         <w:rPr>
           <w:sz w:val="21"/>
           <w:szCs w:val="28"/>
+          <w:rFonts w:hint="eastAsia"/>
         </w:rPr>
         <w:t>     </w:t>
       </w:r>
@@ -650,7 +658,7 @@
       </w:pPr>
       <w:r>
         <w:rPr>
-          <w:rFonts w:ascii="黑体"/>
+          <w:rFonts w:ascii="黑体" w:hint="eastAsia"/>
         </w:rPr>
         <w:t>2024-03-15发布</w:t>
       </w:r>
@@ -668,7 +676,7 @@
       </w:pPr>
       <w:r>
         <w:rPr>
-          <w:rFonts w:ascii="黑体"/>
+          <w:rFonts w:ascii="黑体" w:hint="eastAsia"/>
         </w:rPr>
         <w:t>2024-04-01实施</w:t>
       </w:r>
@@ -689,7 +697,7 @@
       </w:pPr>
       <w:r>
         <w:rPr>
-          <w:rFonts w:hAnsi="黑体"/>
+          <w:rFonts w:hAnsi="黑体" w:hint="eastAsia"/>
           <w:w w:val="100"/>
           <w:sz w:val="28"/>
         </w:rPr>
@@ -794,10 +802,14 @@
       <w:r>
         <w:rPr>
           <w:spacing w:val="320"/>
+          <w:rFonts w:hint="eastAsia"/>
         </w:rPr>
         <w:t>目</w:t>
       </w:r>
       <w:r>
+        <w:rPr>
+          <w:rFonts w:hint="eastAsia"/>
+        </w:rPr>
         <w:t>次</w:t>
       </w:r>
     </w:p>
@@ -805,6 +817,9 @@
       <w:pPr/>
       <w:fldSimple w:instr=" TOC \o &quot;1-3&quot; \h \z \u ">
         <w:r>
+          <w:rPr>
+            <w:rFonts w:hint="eastAsia"/>
+          </w:rPr>
           <w:t>右键此处选择"更新域"以生成目次。</w:t>
         </w:r>
       </w:fldSimple>
@@ -832,26 +847,38 @@
       <w:r>
         <w:rPr>
           <w:spacing w:val="320"/>
+          <w:rFonts w:hint="eastAsia"/>
         </w:rPr>
         <w:t>前</w:t>
       </w:r>
       <w:r>
+        <w:rPr>
+          <w:rFonts w:hint="eastAsia"/>
+        </w:rPr>
         <w:t>言</w:t>
       </w:r>
     </w:p>
     <w:p>
       <w:pPr>
         <w:pStyle w:val="56"/>
+        <w:ind w:firstLine="420"/>
       </w:pPr>
       <w:r>
+        <w:rPr>
+          <w:rFonts w:hint="eastAsia"/>
+        </w:rPr>
         <w:t>本文件按照GB/T 1.1—2020《标准化工作导则　第1部分：标准化文件的结构和起草规则》的规定起草。</w:t>
       </w:r>
     </w:p>
     <w:p>
       <w:pPr>
         <w:pStyle w:val="56"/>
+        <w:ind w:firstLine="420"/>
       </w:pPr>
       <w:r>
+        <w:rPr>
+          <w:rFonts w:hint="eastAsia"/>
+        </w:rPr>
         <w:t>本文件代替T/CCF 001—2020，与T/CCF 001—2020相比，除结构调整和编辑性改动外，主要技术变化如下：</w:t>
       </w:r>
     </w:p>
@@ -864,6 +891,9 @@
         </w:numPr>
       </w:pPr>
       <w:r>
+        <w:rPr>
+          <w:rFonts w:hint="eastAsia"/>
+        </w:rPr>
         <w:t>更改了智能座舱的分级方法（见第5章，2020年版的第4章）</w:t>
       </w:r>
     </w:p>
@@ -876,38 +906,57 @@
         </w:numPr>
       </w:pPr>
       <w:r>
+        <w:rPr>
+          <w:rFonts w:hint="eastAsia"/>
+        </w:rPr>
         <w:t>增加了综合评价指标（见第6章）</w:t>
       </w:r>
     </w:p>
     <w:p>
       <w:pPr>
         <w:pStyle w:val="56"/>
+        <w:ind w:firstLine="420"/>
       </w:pPr>
       <w:r>
+        <w:rPr>
+          <w:rFonts w:hint="eastAsia"/>
+        </w:rPr>
         <w:t>请注意本文件的某些内容可能涉及专利。本文件的发布机构不承担识别专利的责任。</w:t>
       </w:r>
     </w:p>
     <w:p>
       <w:pPr>
         <w:pStyle w:val="56"/>
+        <w:ind w:firstLine="420"/>
       </w:pPr>
       <w:r>
+        <w:rPr>
+          <w:rFonts w:hint="eastAsia"/>
+        </w:rPr>
         <w:t>本文件由中国计算机学会提出并归口。</w:t>
       </w:r>
     </w:p>
     <w:p>
       <w:pPr>
         <w:pStyle w:val="56"/>
+        <w:ind w:firstLine="420"/>
       </w:pPr>
       <w:r>
+        <w:rPr>
+          <w:rFonts w:hint="eastAsia"/>
+        </w:rPr>
         <w:t>本文件起草单位：某某科技有限公司、某某大学。</w:t>
       </w:r>
     </w:p>
     <w:p>
       <w:pPr>
         <w:pStyle w:val="56"/>
+        <w:ind w:firstLine="420"/>
       </w:pPr>
       <w:r>
+        <w:rPr>
+          <w:rFonts w:hint="eastAsia"/>
+        </w:rPr>
         <w:t>本文件主要起草人：张三、李四、王五。</w:t>
       </w:r>
     </w:p>
@@ -934,26 +983,38 @@
       <w:r>
         <w:rPr>
           <w:spacing w:val="320"/>
+          <w:rFonts w:hint="eastAsia"/>
         </w:rPr>
         <w:t>引</w:t>
       </w:r>
       <w:r>
+        <w:rPr>
+          <w:rFonts w:hint="eastAsia"/>
+        </w:rPr>
         <w:t>言</w:t>
       </w:r>
     </w:p>
     <w:p>
       <w:pPr>
         <w:pStyle w:val="56"/>
+        <w:ind w:firstLine="420"/>
       </w:pPr>
       <w:r>
+        <w:rPr>
+          <w:rFonts w:hint="eastAsia"/>
+        </w:rPr>
         <w:t>随着汽车智能化的发展，智能座舱已成为衡量整车智能水平的重要组成部分。</w:t>
       </w:r>
     </w:p>
     <w:p>
       <w:pPr>
         <w:pStyle w:val="56"/>
+        <w:ind w:firstLine="420"/>
       </w:pPr>
       <w:r>
+        <w:rPr>
+          <w:rFonts w:hint="eastAsia"/>
+        </w:rPr>
         <w:t>本文件旨在规范智能座舱的分级方法与综合评价指标，为相关产品的研发与评测提供依据。</w:t>
       </w:r>
     </w:p>
@@ -980,6 +1041,7 @@
       <w:r>
         <w:rPr>
           <w:b/>
+          <w:rFonts w:hint="eastAsia"/>
         </w:rPr>
         <w:t>智能座舱分级与综合评价</w:t>
       </w:r>
@@ -989,22 +1051,33 @@
         <w:pStyle w:val="104"/>
       </w:pPr>
       <w:r>
+        <w:rPr>
+          <w:rFonts w:hint="eastAsia"/>
+        </w:rPr>
         <w:t>范围</w:t>
       </w:r>
     </w:p>
     <w:p>
       <w:pPr>
         <w:pStyle w:val="56"/>
+        <w:ind w:firstLine="420"/>
       </w:pPr>
       <w:r>
+        <w:rPr>
+          <w:rFonts w:hint="eastAsia"/>
+        </w:rPr>
         <w:t>本文件规定了智能座舱的分级方法、技术要求和综合评价指标。</w:t>
       </w:r>
     </w:p>
     <w:p>
       <w:pPr>
         <w:pStyle w:val="56"/>
+        <w:ind w:firstLine="420"/>
       </w:pPr>
       <w:r>
+        <w:rPr>
+          <w:rFonts w:hint="eastAsia"/>
+        </w:rPr>
         <w:t>本文件适用于乘用车智能座舱的设计、开发与评价。</w:t>
       </w:r>
     </w:p>
@@ -1013,27 +1086,41 @@
         <w:pStyle w:val="104"/>
       </w:pPr>
       <w:r>
+        <w:rPr>
+          <w:rFonts w:hint="eastAsia"/>
+        </w:rPr>
         <w:t>规范性引用文件</w:t>
       </w:r>
     </w:p>
     <w:p>
       <w:pPr>
         <w:pStyle w:val="56"/>
+        <w:ind w:firstLine="420"/>
       </w:pPr>
       <w:r>
+        <w:rPr>
+          <w:rFonts w:hint="eastAsia"/>
+        </w:rPr>
         <w:t>下列文件中的内容通过文中的规范性引用而构成本文件必不可少的条款。其中，注日期的引用文件，仅该日期对应的版本适用于本文件；不注日期的引用文件，其最新版本（包括所有的修改单）适用于本文件。</w:t>
       </w:r>
     </w:p>
     <w:p>
       <w:pPr>
         <w:pStyle w:val="56"/>
+        <w:ind w:firstLine="420"/>
       </w:pPr>
       <w:bookmarkStart w:id="1000" w:name="Ref_241667a9d08a29af"/>
       <w:r>
+        <w:rPr>
+          <w:rFonts w:hint="eastAsia"/>
+        </w:rPr>
         <w:t>GB/T 1.1—2020</w:t>
       </w:r>
       <w:bookmarkEnd w:id="1000"/>
       <w:r>
+        <w:rPr>
+          <w:rFonts w:hint="eastAsia"/>
+        </w:rPr>
         <w:t xml:space="preserve">  标准化工作导则　第1部分：标准化文件的结构和起草规则</w:t>
       </w:r>
     </w:p>
@@ -1042,14 +1129,21 @@
         <w:pStyle w:val="104"/>
       </w:pPr>
       <w:r>
+        <w:rPr>
+          <w:rFonts w:hint="eastAsia"/>
+        </w:rPr>
         <w:t>术语和定义</w:t>
       </w:r>
     </w:p>
     <w:p>
       <w:pPr>
         <w:pStyle w:val="56"/>
+        <w:ind w:firstLine="420"/>
       </w:pPr>
       <w:r>
+        <w:rPr>
+          <w:rFonts w:hint="eastAsia"/>
+        </w:rPr>
         <w:t>下列术语和定义适用于本文件。</w:t>
       </w:r>
     </w:p>
@@ -1065,19 +1159,25 @@
     <w:p>
       <w:pPr>
         <w:pStyle w:val="56"/>
+        <w:ind w:firstLine="420"/>
       </w:pPr>
       <w:r>
         <w:rPr>
           <w:b/>
+          <w:rFonts w:hint="eastAsia"/>
         </w:rPr>
         <w:t>智能座舱</w:t>
       </w:r>
       <w:r>
+        <w:rPr>
+          <w:rFonts w:hint="eastAsia"/>
+        </w:rPr>
         <w:t xml:space="preserve">　</w:t>
       </w:r>
       <w:r>
         <w:rPr>
           <w:b/>
+          <w:rFonts w:hint="eastAsia"/>
         </w:rPr>
         <w:t>intelligent cockpit</w:t>
       </w:r>
@@ -1085,8 +1185,12 @@
     <w:p>
       <w:pPr>
         <w:pStyle w:val="56"/>
+        <w:ind w:firstLine="420"/>
       </w:pPr>
       <w:r>
+        <w:rPr>
+          <w:rFonts w:hint="eastAsia"/>
+        </w:rPr>
         <w:t>以驾乘人员为中心，融合多模态交互、场景感知与服务的车内空间系统。</w:t>
       </w:r>
     </w:p>
@@ -1102,19 +1206,25 @@
     <w:p>
       <w:pPr>
         <w:pStyle w:val="56"/>
+        <w:ind w:firstLine="420"/>
       </w:pPr>
       <w:r>
         <w:rPr>
           <w:b/>
+          <w:rFonts w:hint="eastAsia"/>
         </w:rPr>
         <w:t>多模态交互</w:t>
       </w:r>
       <w:r>
+        <w:rPr>
+          <w:rFonts w:hint="eastAsia"/>
+        </w:rPr>
         <w:t xml:space="preserve">　</w:t>
       </w:r>
       <w:r>
         <w:rPr>
           <w:b/>
+          <w:rFonts w:hint="eastAsia"/>
         </w:rPr>
         <w:t>multimodal interaction</w:t>
       </w:r>
@@ -1122,8 +1232,12 @@
     <w:p>
       <w:pPr>
         <w:pStyle w:val="56"/>
+        <w:ind w:firstLine="420"/>
       </w:pPr>
       <w:r>
+        <w:rPr>
+          <w:rFonts w:hint="eastAsia"/>
+        </w:rPr>
         <w:t>综合运用语音、触控、视觉等多种方式进行人机信息交换的交互形式。</w:t>
       </w:r>
     </w:p>
@@ -1132,30 +1246,45 @@
         <w:pStyle w:val="104"/>
       </w:pPr>
       <w:r>
+        <w:rPr>
+          <w:rFonts w:hint="eastAsia"/>
+        </w:rPr>
         <w:t>分级方法</w:t>
       </w:r>
     </w:p>
     <w:p>
       <w:pPr>
         <w:pStyle w:val="105"/>
+        <w:spacing w:before="156" w:after="156"/>
       </w:pPr>
       <w:r>
+        <w:rPr>
+          <w:rFonts w:hint="eastAsia"/>
+        </w:rPr>
         <w:t>分级原则</w:t>
       </w:r>
     </w:p>
     <w:p>
       <w:pPr>
         <w:pStyle w:val="56"/>
+        <w:ind w:firstLine="420"/>
       </w:pPr>
       <w:r>
+        <w:rPr>
+          <w:rFonts w:hint="eastAsia"/>
+        </w:rPr>
         <w:t>智能座舱按交互能力、感知能力和服务能力分为 L0 至 L4 共 5 个等级。</w:t>
       </w:r>
     </w:p>
     <w:p>
       <w:pPr>
         <w:pStyle w:val="56"/>
+        <w:ind w:firstLine="420"/>
       </w:pPr>
       <w:r>
+        <w:rPr>
+          <w:rFonts w:hint="eastAsia"/>
+        </w:rPr>
         <w:t>分级应遵循下列原则：</w:t>
       </w:r>
     </w:p>
@@ -1168,6 +1297,9 @@
         </w:numPr>
       </w:pPr>
       <w:r>
+        <w:rPr>
+          <w:rFonts w:hint="eastAsia"/>
+        </w:rPr>
         <w:t>以驾乘人员的实际体验为核心；</w:t>
       </w:r>
     </w:p>
@@ -1180,6 +1312,9 @@
         </w:numPr>
       </w:pPr>
       <w:r>
+        <w:rPr>
+          <w:rFonts w:hint="eastAsia"/>
+        </w:rPr>
         <w:t>兼顾安全性与可用性；</w:t>
       </w:r>
     </w:p>
@@ -1192,22 +1327,33 @@
         </w:numPr>
       </w:pPr>
       <w:r>
+        <w:rPr>
+          <w:rFonts w:hint="eastAsia"/>
+        </w:rPr>
         <w:t>可量化、可验证。</w:t>
       </w:r>
     </w:p>
     <w:p>
       <w:pPr>
         <w:pStyle w:val="105"/>
+        <w:spacing w:before="156" w:after="156"/>
       </w:pPr>
       <w:r>
+        <w:rPr>
+          <w:rFonts w:hint="eastAsia"/>
+        </w:rPr>
         <w:t>等级划分</w:t>
       </w:r>
     </w:p>
     <w:p>
       <w:pPr>
         <w:pStyle w:val="56"/>
+        <w:ind w:firstLine="420"/>
       </w:pPr>
       <w:r>
+        <w:rPr>
+          <w:rFonts w:hint="eastAsia"/>
+        </w:rPr>
         <w:t>各等级的能力要求如下：</w:t>
       </w:r>
     </w:p>
@@ -1220,6 +1366,9 @@
         </w:numPr>
       </w:pPr>
       <w:r>
+        <w:rPr>
+          <w:rFonts w:hint="eastAsia"/>
+        </w:rPr>
         <w:t>L0：仅提供基础信息显示；</w:t>
       </w:r>
     </w:p>
@@ -1232,6 +1381,9 @@
         </w:numPr>
       </w:pPr>
       <w:r>
+        <w:rPr>
+          <w:rFonts w:hint="eastAsia"/>
+        </w:rPr>
         <w:t>L1：支持单一模态交互；</w:t>
       </w:r>
     </w:p>
@@ -1244,6 +1396,9 @@
         </w:numPr>
       </w:pPr>
       <w:r>
+        <w:rPr>
+          <w:rFonts w:hint="eastAsia"/>
+        </w:rPr>
         <w:t>L2：支持多模态交互与基础场景感知。</w:t>
       </w:r>
     </w:p>
@@ -1254,8 +1409,12 @@
           <w:ilvl w:val="0"/>
           <w:numId w:val="16"/>
         </w:numPr>
+        <w:keepNext/>
       </w:pPr>
       <w:r>
+        <w:rPr>
+          <w:rFonts w:hint="eastAsia"/>
+        </w:rPr>
         <w:t xml:space="preserve">　</w:t>
       </w:r>
       <w:bookmarkStart w:id="1001" w:name="_Ref314611919"/>
@@ -1263,6 +1422,9 @@
       <w:bookmarkStart w:id="1003" w:name="_Ref494958920"/>
       <w:bookmarkStart w:id="1004" w:name="_Ref405096541"/>
       <w:r>
+        <w:rPr>
+          <w:rFonts w:hint="eastAsia"/>
+        </w:rPr>
         <w:t>智能座舱分级能力对照</w:t>
       </w:r>
       <w:bookmarkEnd w:id="1001"/>
@@ -1315,6 +1477,9 @@
             </w:pPr>
             <w:r/>
             <w:r>
+              <w:rPr>
+                <w:rFonts w:hint="eastAsia"/>
+              </w:rPr>
               <w:t>等级</w:t>
             </w:r>
           </w:p>
@@ -1340,6 +1505,9 @@
             </w:pPr>
             <w:r/>
             <w:r>
+              <w:rPr>
+                <w:rFonts w:hint="eastAsia"/>
+              </w:rPr>
               <w:t>交互能力</w:t>
             </w:r>
           </w:p>
@@ -1365,6 +1533,9 @@
             </w:pPr>
             <w:r/>
             <w:r>
+              <w:rPr>
+                <w:rFonts w:hint="eastAsia"/>
+              </w:rPr>
               <w:t>感知能力</w:t>
             </w:r>
           </w:p>
@@ -1390,6 +1561,9 @@
             </w:pPr>
             <w:r/>
             <w:r>
+              <w:rPr>
+                <w:rFonts w:hint="eastAsia"/>
+              </w:rPr>
               <w:t>服务能力</w:t>
             </w:r>
           </w:p>
@@ -1414,6 +1588,9 @@
             </w:pPr>
             <w:r/>
             <w:r>
+              <w:rPr>
+                <w:rFonts w:hint="eastAsia"/>
+              </w:rPr>
               <w:t>L0</w:t>
             </w:r>
           </w:p>
@@ -1436,6 +1613,9 @@
             </w:pPr>
             <w:r/>
             <w:r>
+              <w:rPr>
+                <w:rFonts w:hint="eastAsia"/>
+              </w:rPr>
               <w:t>基础</w:t>
             </w:r>
           </w:p>
@@ -1458,6 +1638,9 @@
             </w:pPr>
             <w:r/>
             <w:r>
+              <w:rPr>
+                <w:rFonts w:hint="eastAsia"/>
+              </w:rPr>
               <w:t>无</w:t>
             </w:r>
           </w:p>
@@ -1480,6 +1663,9 @@
             </w:pPr>
             <w:r/>
             <w:r>
+              <w:rPr>
+                <w:rFonts w:hint="eastAsia"/>
+              </w:rPr>
               <w:t>无</w:t>
             </w:r>
           </w:p>
@@ -1504,6 +1690,9 @@
             </w:pPr>
             <w:r/>
             <w:r>
+              <w:rPr>
+                <w:rFonts w:hint="eastAsia"/>
+              </w:rPr>
               <w:t>L1</w:t>
             </w:r>
           </w:p>
@@ -1526,6 +1715,9 @@
             </w:pPr>
             <w:r/>
             <w:r>
+              <w:rPr>
+                <w:rFonts w:hint="eastAsia"/>
+              </w:rPr>
               <w:t>单模态</w:t>
             </w:r>
           </w:p>
@@ -1548,6 +1740,9 @@
             </w:pPr>
             <w:r/>
             <w:r>
+              <w:rPr>
+                <w:rFonts w:hint="eastAsia"/>
+              </w:rPr>
               <w:t>弱</w:t>
             </w:r>
           </w:p>
@@ -1570,6 +1765,9 @@
             </w:pPr>
             <w:r/>
             <w:r>
+              <w:rPr>
+                <w:rFonts w:hint="eastAsia"/>
+              </w:rPr>
               <w:t>基础</w:t>
             </w:r>
           </w:p>
@@ -1594,6 +1792,9 @@
             </w:pPr>
             <w:r/>
             <w:r>
+              <w:rPr>
+                <w:rFonts w:hint="eastAsia"/>
+              </w:rPr>
               <w:t>L2</w:t>
             </w:r>
           </w:p>
@@ -1616,6 +1817,9 @@
             </w:pPr>
             <w:r/>
             <w:r>
+              <w:rPr>
+                <w:rFonts w:hint="eastAsia"/>
+              </w:rPr>
               <w:t>多模态</w:t>
             </w:r>
           </w:p>
@@ -1638,6 +1842,9 @@
             </w:pPr>
             <w:r/>
             <w:r>
+              <w:rPr>
+                <w:rFonts w:hint="eastAsia"/>
+              </w:rPr>
               <w:t>中</w:t>
             </w:r>
           </w:p>
@@ -1660,6 +1867,9 @@
             </w:pPr>
             <w:r/>
             <w:r>
+              <w:rPr>
+                <w:rFonts w:hint="eastAsia"/>
+              </w:rPr>
               <w:t>进阶</w:t>
             </w:r>
           </w:p>
@@ -1684,6 +1894,9 @@
             </w:pPr>
             <w:r/>
             <w:r>
+              <w:rPr>
+                <w:rFonts w:hint="eastAsia"/>
+              </w:rPr>
               <w:t>上表中的能力等级仅用于示意，具体指标见第6章。</w:t>
             </w:r>
           </w:p>
@@ -1695,22 +1908,33 @@
         <w:pStyle w:val="104"/>
       </w:pPr>
       <w:r>
+        <w:rPr>
+          <w:rFonts w:hint="eastAsia"/>
+        </w:rPr>
         <w:t>综合评价</w:t>
       </w:r>
     </w:p>
     <w:p>
       <w:pPr>
         <w:pStyle w:val="105"/>
+        <w:spacing w:before="156" w:after="156"/>
       </w:pPr>
       <w:r>
+        <w:rPr>
+          <w:rFonts w:hint="eastAsia"/>
+        </w:rPr>
         <w:t>评价指标</w:t>
       </w:r>
     </w:p>
     <w:p>
       <w:pPr>
         <w:pStyle w:val="56"/>
+        <w:ind w:firstLine="420"/>
       </w:pPr>
       <w:r>
+        <w:rPr>
+          <w:rFonts w:hint="eastAsia"/>
+        </w:rPr>
         <w:t>综合评价包括交互效率、场景适应性和用户满意度三个维度。</w:t>
       </w:r>
     </w:p>
@@ -1719,40 +1943,59 @@
         <w:pStyle w:val="181"/>
       </w:pPr>
       <w:r>
+        <w:rPr>
+          <w:rFonts w:hint="eastAsia"/>
+        </w:rPr>
         <w:t>交互效率可用任务完成时间与操作步数综合衡量。</w:t>
       </w:r>
     </w:p>
     <w:p>
       <w:pPr>
         <w:pStyle w:val="105"/>
+        <w:spacing w:before="156" w:after="156"/>
       </w:pPr>
       <w:r>
+        <w:rPr>
+          <w:rFonts w:hint="eastAsia"/>
+        </w:rPr>
         <w:t>评价方法</w:t>
       </w:r>
     </w:p>
     <w:p>
       <w:pPr>
         <w:pStyle w:val="56"/>
+        <w:ind w:firstLine="420"/>
       </w:pPr>
       <w:r>
+        <w:rPr>
+          <w:rFonts w:hint="eastAsia"/>
+        </w:rPr>
         <w:t xml:space="preserve">应采用 </w:t>
       </w:r>
       <w:r>
         <w:rPr>
+          <w:rFonts w:hint="eastAsia"/>
           <w:b/>
         </w:rPr>
         <w:t>客观测试</w:t>
       </w:r>
       <w:r>
+        <w:rPr>
+          <w:rFonts w:hint="eastAsia"/>
+        </w:rPr>
         <w:t xml:space="preserve"> 与 </w:t>
       </w:r>
       <w:r>
         <w:rPr>
+          <w:rFonts w:hint="eastAsia"/>
           <w:i/>
         </w:rPr>
         <w:t>主观评分</w:t>
       </w:r>
       <w:r>
+        <w:rPr>
+          <w:rFonts w:hint="eastAsia"/>
+        </w:rPr>
         <w:t xml:space="preserve"> 相结合的方法进行评价。</w:t>
       </w:r>
     </w:p>
@@ -1781,7 +2024,7 @@
       </w:r>
       <w:r>
         <w:rPr>
-          <w:rFonts w:ascii="黑体" w:eastAsia="黑体"/>
+          <w:rFonts w:ascii="黑体" w:eastAsia="黑体" w:hint="eastAsia"/>
         </w:rPr>
         <w:t>（规范性）</w:t>
       </w:r>
@@ -1790,7 +2033,7 @@
       </w:r>
       <w:r>
         <w:rPr>
-          <w:rFonts w:ascii="黑体" w:hAnsi="Times New Roman" w:eastAsia="黑体" w:cs="Times New Roman"/>
+          <w:rFonts w:ascii="黑体" w:hAnsi="Times New Roman" w:eastAsia="黑体" w:cs="Times New Roman" w:hint="eastAsia"/>
           <w:kern w:val="21"/>
           <w:sz w:val="21"/>
           <w:lang w:val="en-US" w:eastAsia="zh-CN" w:bidi="ar-SA"/>
@@ -1829,14 +2072,21 @@
         <w:pStyle w:val="78"/>
       </w:pPr>
       <w:r>
+        <w:rPr>
+          <w:rFonts w:hint="eastAsia"/>
+        </w:rPr>
         <w:t>判定步骤</w:t>
       </w:r>
     </w:p>
     <w:p>
       <w:pPr>
         <w:pStyle w:val="56"/>
+        <w:ind w:firstLine="420"/>
       </w:pPr>
       <w:r>
+        <w:rPr>
+          <w:rFonts w:hint="eastAsia"/>
+        </w:rPr>
         <w:t>按下列步骤进行分级判定：</w:t>
       </w:r>
     </w:p>
@@ -1849,6 +2099,9 @@
         </w:numPr>
       </w:pPr>
       <w:r>
+        <w:rPr>
+          <w:rFonts w:hint="eastAsia"/>
+        </w:rPr>
         <w:t>确定座舱具备的交互模态数量；</w:t>
       </w:r>
     </w:p>
@@ -1861,6 +2114,9 @@
         </w:numPr>
       </w:pPr>
       <w:r>
+        <w:rPr>
+          <w:rFonts w:hint="eastAsia"/>
+        </w:rPr>
         <w:t>评估场景感知与服务能力；</w:t>
       </w:r>
     </w:p>
@@ -1873,6 +2129,9 @@
         </w:numPr>
       </w:pPr>
       <w:r>
+        <w:rPr>
+          <w:rFonts w:hint="eastAsia"/>
+        </w:rPr>
         <w:t>综合得出等级。</w:t>
       </w:r>
     </w:p>
@@ -1900,7 +2159,7 @@
       </w:r>
       <w:r>
         <w:rPr>
-          <w:rFonts w:ascii="黑体" w:eastAsia="黑体"/>
+          <w:rFonts w:ascii="黑体" w:eastAsia="黑体" w:hint="eastAsia"/>
         </w:rPr>
         <w:t>（资料性）</w:t>
       </w:r>
@@ -1909,7 +2168,7 @@
       </w:r>
       <w:r>
         <w:rPr>
-          <w:rFonts w:ascii="黑体" w:hAnsi="Times New Roman" w:eastAsia="黑体" w:cs="Times New Roman"/>
+          <w:rFonts w:ascii="黑体" w:hAnsi="Times New Roman" w:eastAsia="黑体" w:cs="Times New Roman" w:hint="eastAsia"/>
           <w:kern w:val="21"/>
           <w:sz w:val="21"/>
           <w:lang w:val="en-US" w:eastAsia="zh-CN" w:bidi="ar-SA"/>
@@ -1948,14 +2207,21 @@
         <w:pStyle w:val="78"/>
       </w:pPr>
       <w:r>
+        <w:rPr>
+          <w:rFonts w:hint="eastAsia"/>
+        </w:rPr>
         <w:t>交互效率计算</w:t>
       </w:r>
     </w:p>
     <w:p>
       <w:pPr>
         <w:pStyle w:val="56"/>
+        <w:ind w:firstLine="420"/>
       </w:pPr>
       <w:r>
+        <w:rPr>
+          <w:rFonts w:hint="eastAsia"/>
+        </w:rPr>
         <w:t>交互效率得分按相关公式计算，具体方法参见相关文献。</w:t>
       </w:r>
     </w:p>
@@ -1997,6 +2263,9 @@
         <w:pStyle w:val="64"/>
       </w:pPr>
       <w:r>
+        <w:rPr>
+          <w:rFonts w:hint="eastAsia"/>
+        </w:rPr>
         <w:t>GB/T 1.1—2020　标准化工作导则　第1部分：标准化文件的结构和起草规则</w:t>
       </w:r>
     </w:p>
@@ -2005,12 +2274,16 @@
         <w:pStyle w:val="64"/>
       </w:pPr>
       <w:r>
+        <w:rPr>
+          <w:rFonts w:hint="eastAsia"/>
+        </w:rPr>
         <w:t>ISO 11783　Tractors and machinery for agriculture and forestry</w:t>
       </w:r>
     </w:p>
     <w:p>
       <w:pPr>
         <w:pStyle w:val="56"/>
+        <w:ind w:left="0"/>
         <w:jc w:val="center"/>
       </w:pPr>
       <w:r>
@@ -2115,6 +2388,7 @@
     <w:r>
       <w:rPr>
         <w:lang w:val="zh-CN"/>
+        <w:rFonts w:hint="eastAsia"/>
       </w:rPr>
       <w:t>2</w:t>
     </w:r>
@@ -2159,6 +2433,7 @@
     <w:r>
       <w:rPr>
         <w:lang w:val="zh-CN"/>
+        <w:rFonts w:hint="eastAsia"/>
       </w:rPr>
       <w:t>1</w:t>
     </w:r>
@@ -2207,7 +2482,7 @@
     </w:pPr>
     <w:r>
       <w:rPr>
-        <w:rFonts w:ascii="黑体" w:hAnsi="黑体" w:eastAsia="黑体"/>
+        <w:rFonts w:ascii="黑体" w:hAnsi="黑体" w:eastAsia="黑体" w:hint="eastAsia"/>
       </w:rPr>
       <w:t>Q/LB.</w:t>
     </w:r>
@@ -2219,7 +2494,7 @@
     </w:r>
     <w:r>
       <w:rPr>
-        <w:rFonts w:ascii="黑体" w:hAnsi="黑体" w:eastAsia="黑体"/>
+        <w:rFonts w:ascii="黑体" w:hAnsi="黑体" w:eastAsia="黑体" w:hint="eastAsia"/>
       </w:rPr>
       <w:t>XXXXX-XXXX</w:t>
     </w:r>
@@ -2269,6 +2544,9 @@
       <w:fldChar w:fldCharType="separate"/>
     </w:r>
     <w:r>
+      <w:rPr>
+        <w:rFonts w:hint="eastAsia"/>
+      </w:rPr>
       <w:t>T/XXX XXXX—XXXX</w:t>
     </w:r>
     <w:r>
@@ -2295,6 +2573,9 @@
       <w:fldChar w:fldCharType="separate"/>
     </w:r>
     <w:r>
+      <w:rPr>
+        <w:rFonts w:hint="eastAsia"/>
+      </w:rPr>
       <w:t>T/XXX XXXX—XXXX</w:t>
     </w:r>
     <w:r>
@@ -7284,6 +7565,7 @@
       <w:autoSpaceDN w:val="0"/>
       <w:ind w:firstLine="200" w:firstLineChars="200"/>
       <w:jc w:val="both"/>
+      <w:spacing w:before="0" w:after="0" w:line="400" w:lineRule="exact"/>
     </w:pPr>
     <w:rPr>
       <w:rFonts w:ascii="宋体" w:hAnsi="Times New Roman" w:eastAsia="宋体" w:cs="Times New Roman"/>
@@ -7403,6 +7685,7 @@
         <w:ilvl w:val="0"/>
         <w:numId w:val="1"/>
       </w:numPr>
+      <w:spacing w:before="0" w:after="0" w:line="400" w:lineRule="exact"/>
     </w:pPr>
     <w:rPr>
       <w:rFonts w:ascii="宋体" w:hAnsi="Times New Roman" w:eastAsia="宋体" w:cs="Times New Roman"/>
@@ -7419,7 +7702,7 @@
         <w:ilvl w:val="3"/>
         <w:numId w:val="2"/>
       </w:numPr>
-      <w:spacing w:before="50" w:beforeLines="50" w:after="50" w:afterLines="50"/>
+      <w:spacing w:before="50" w:beforeLines="50" w:after="50" w:afterLines="50" w:line="400" w:lineRule="exact"/>
       <w:jc w:val="both"/>
       <w:outlineLvl w:val="2"/>
     </w:pPr>
@@ -7591,7 +7874,7 @@
       </w:numPr>
       <w:adjustRightInd w:val="0"/>
       <w:snapToGrid w:val="0"/>
-      <w:spacing w:before="50" w:beforeLines="50" w:after="50" w:afterLines="50"/>
+      <w:spacing w:before="50" w:beforeLines="50" w:after="50" w:afterLines="50" w:line="400" w:lineRule="exact"/>
       <w:jc w:val="center"/>
       <w:textAlignment w:val="baseline"/>
     </w:pPr>
@@ -7711,7 +7994,7 @@
       </w:numPr>
       <w:adjustRightInd w:val="0"/>
       <w:snapToGrid w:val="0"/>
-      <w:spacing w:before="50" w:beforeLines="50" w:after="50" w:afterLines="50"/>
+      <w:spacing w:before="50" w:beforeLines="50" w:after="50" w:afterLines="50" w:line="400" w:lineRule="exact"/>
       <w:jc w:val="center"/>
     </w:pPr>
     <w:rPr>
@@ -7855,6 +8138,7 @@
       </w:numPr>
       <w:adjustRightInd w:val="0"/>
       <w:snapToGrid w:val="0"/>
+      <w:spacing w:before="0" w:after="0" w:line="400" w:lineRule="exact"/>
     </w:pPr>
     <w:rPr>
       <w:rFonts w:ascii="Times New Roman" w:hAnsi="Times New Roman" w:eastAsia="宋体" w:cs="Times New Roman"/>
@@ -7870,6 +8154,7 @@
       <w:numPr>
         <w:numId w:val="10"/>
       </w:numPr>
+      <w:spacing w:before="0" w:after="0" w:line="400" w:lineRule="exact"/>
     </w:pPr>
   </w:style>
   <w:style w:type="paragraph" w:customStyle="1" w:styleId="94">
@@ -7883,6 +8168,7 @@
         <w:ilvl w:val="4"/>
       </w:numPr>
       <w:outlineLvl w:val="3"/>
+      <w:spacing w:before="50" w:after="50" w:line="400" w:lineRule="exact"/>
     </w:pPr>
   </w:style>
   <w:style w:type="character" w:customStyle="1" w:styleId="95">
@@ -7918,6 +8204,7 @@
         <w:numId w:val="11"/>
       </w:numPr>
       <w:jc w:val="both"/>
+      <w:spacing w:before="0" w:after="0" w:line="400" w:lineRule="exact"/>
     </w:pPr>
     <w:rPr>
       <w:rFonts w:ascii="宋体" w:hAnsi="宋体" w:eastAsia="宋体" w:cs="Times New Roman"/>
@@ -7935,7 +8222,7 @@
         <w:ilvl w:val="5"/>
         <w:numId w:val="2"/>
       </w:numPr>
-      <w:spacing w:before="50" w:beforeLines="50" w:after="50" w:afterLines="50"/>
+      <w:spacing w:before="50" w:beforeLines="50" w:after="50" w:afterLines="50" w:line="400" w:lineRule="exact"/>
       <w:jc w:val="both"/>
       <w:outlineLvl w:val="4"/>
     </w:pPr>
@@ -8009,7 +8296,7 @@
         <w:ilvl w:val="6"/>
         <w:numId w:val="2"/>
       </w:numPr>
-      <w:spacing w:before="50" w:beforeLines="50" w:after="50" w:afterLines="50"/>
+      <w:spacing w:before="50" w:beforeLines="50" w:after="50" w:afterLines="50" w:line="400" w:lineRule="exact"/>
       <w:jc w:val="both"/>
       <w:outlineLvl w:val="5"/>
     </w:pPr>
@@ -8028,7 +8315,7 @@
         <w:ilvl w:val="1"/>
         <w:numId w:val="2"/>
       </w:numPr>
-      <w:spacing w:before="100" w:beforeLines="100" w:after="100" w:afterLines="100"/>
+      <w:spacing w:before="240" w:after="240" w:line="400" w:lineRule="exact"/>
       <w:jc w:val="both"/>
       <w:outlineLvl w:val="0"/>
     </w:pPr>
@@ -8047,7 +8334,7 @@
       <w:numPr>
         <w:ilvl w:val="2"/>
       </w:numPr>
-      <w:spacing w:before="50" w:beforeLines="50" w:after="50" w:afterLines="50"/>
+      <w:spacing w:before="50" w:beforeLines="50" w:after="50" w:afterLines="50" w:line="400" w:lineRule="exact"/>
       <w:outlineLvl w:val="1"/>
     </w:pPr>
   </w:style>
@@ -8103,6 +8390,7 @@
         <w:numId w:val="13"/>
       </w:numPr>
       <w:jc w:val="both"/>
+      <w:spacing w:before="0" w:after="0" w:line="400" w:lineRule="exact"/>
     </w:pPr>
     <w:rPr>
       <w:rFonts w:ascii="宋体" w:hAnsi="Times New Roman" w:eastAsia="宋体" w:cs="Times New Roman"/>
@@ -8168,7 +8456,7 @@
       <w:tabs>
         <w:tab w:val="left" w:pos="0"/>
       </w:tabs>
-      <w:spacing w:before="50" w:beforeLines="50" w:after="50" w:afterLines="50"/>
+      <w:spacing w:before="50" w:beforeLines="50" w:after="50" w:afterLines="50" w:line="400" w:lineRule="exact"/>
       <w:jc w:val="center"/>
     </w:pPr>
     <w:rPr>
@@ -8202,7 +8490,7 @@
         <w:ilvl w:val="0"/>
         <w:numId w:val="17"/>
       </w:numPr>
-      <w:spacing w:before="50" w:beforeLines="50" w:after="50" w:afterLines="50"/>
+      <w:spacing w:before="50" w:beforeLines="50" w:after="50" w:afterLines="50" w:line="400" w:lineRule="exact"/>
       <w:jc w:val="center"/>
     </w:pPr>
     <w:rPr>
@@ -8254,6 +8542,7 @@
         <w:ilvl w:val="2"/>
         <w:numId w:val="13"/>
       </w:numPr>
+      <w:spacing w:before="0" w:after="0" w:line="400" w:lineRule="exact"/>
     </w:pPr>
     <w:rPr>
       <w:rFonts w:ascii="宋体" w:hAnsi="Times New Roman" w:eastAsia="宋体" w:cs="Times New Roman"/>
@@ -8872,7 +9161,7 @@
     <w:qFormat/>
     <w:uiPriority w:val="0"/>
     <w:pPr>
-      <w:spacing w:before="0" w:beforeLines="0" w:after="0" w:afterLines="0"/>
+      <w:spacing w:before="0" w:beforeLines="0" w:after="0" w:afterLines="0" w:line="400" w:lineRule="exact"/>
       <w:outlineLvl w:val="9"/>
     </w:pPr>
     <w:rPr>
@@ -8885,7 +9174,7 @@
     <w:qFormat/>
     <w:uiPriority w:val="0"/>
     <w:pPr>
-      <w:spacing w:before="0" w:beforeLines="0" w:after="0" w:afterLines="0"/>
+      <w:spacing w:before="0" w:beforeLines="0" w:after="0" w:afterLines="0" w:line="400" w:lineRule="exact"/>
       <w:outlineLvl w:val="9"/>
     </w:pPr>
     <w:rPr>
@@ -8898,7 +9187,7 @@
     <w:qFormat/>
     <w:uiPriority w:val="0"/>
     <w:pPr>
-      <w:spacing w:before="0" w:beforeLines="0" w:after="0" w:afterLines="0"/>
+      <w:spacing w:before="0" w:beforeLines="0" w:after="0" w:afterLines="0" w:line="400" w:lineRule="exact"/>
       <w:outlineLvl w:val="9"/>
     </w:pPr>
     <w:rPr>
@@ -8911,7 +9200,7 @@
     <w:qFormat/>
     <w:uiPriority w:val="0"/>
     <w:pPr>
-      <w:spacing w:before="0" w:beforeLines="0" w:after="0" w:afterLines="0"/>
+      <w:spacing w:before="0" w:beforeLines="0" w:after="0" w:afterLines="0" w:line="400" w:lineRule="exact"/>
       <w:outlineLvl w:val="9"/>
     </w:pPr>
     <w:rPr>
@@ -8934,7 +9223,7 @@
     <w:qFormat/>
     <w:uiPriority w:val="0"/>
     <w:pPr>
-      <w:spacing w:before="0" w:beforeLines="0" w:after="0" w:afterLines="0"/>
+      <w:spacing w:before="0" w:beforeLines="0" w:after="0" w:afterLines="0" w:line="400" w:lineRule="exact"/>
       <w:outlineLvl w:val="9"/>
     </w:pPr>
     <w:rPr>
@@ -9040,6 +9329,7 @@
         <w:numId w:val="13"/>
       </w:numPr>
       <w:jc w:val="both"/>
+      <w:spacing w:before="0" w:after="0" w:line="400" w:lineRule="exact"/>
     </w:pPr>
     <w:rPr>
       <w:rFonts w:ascii="宋体" w:hAnsi="Times New Roman" w:eastAsia="宋体" w:cs="Times New Roman"/>
@@ -9121,6 +9411,7 @@
       <w:autoSpaceDE w:val="0"/>
       <w:autoSpaceDN w:val="0"/>
       <w:jc w:val="both"/>
+      <w:spacing w:before="0" w:after="0" w:line="300" w:lineRule="exact"/>
     </w:pPr>
     <w:rPr>
       <w:rFonts w:ascii="宋体" w:hAnsi="Times New Roman" w:eastAsia="宋体" w:cs="Times New Roman"/>
@@ -9141,6 +9432,7 @@
       <w:autoSpaceDE w:val="0"/>
       <w:autoSpaceDN w:val="0"/>
       <w:jc w:val="both"/>
+      <w:spacing w:before="0" w:after="0" w:line="300" w:lineRule="exact"/>
     </w:pPr>
     <w:rPr>
       <w:rFonts w:ascii="宋体" w:hAnsi="Times New Roman" w:eastAsia="宋体" w:cs="Times New Roman"/>
@@ -9160,6 +9452,7 @@
         <w:numId w:val="28"/>
       </w:numPr>
       <w:jc w:val="both"/>
+      <w:spacing w:before="0" w:after="0" w:line="400" w:lineRule="exact"/>
     </w:pPr>
     <w:rPr>
       <w:rFonts w:ascii="宋体" w:hAnsi="Times New Roman" w:eastAsia="宋体" w:cs="Times New Roman"/>
@@ -9175,6 +9468,7 @@
     <w:uiPriority w:val="0"/>
     <w:pPr>
       <w:ind w:firstLine="420"/>
+      <w:spacing w:before="0" w:after="0" w:line="400" w:lineRule="exact"/>
     </w:pPr>
     <w:rPr>
       <w:sz w:val="18"/>
@@ -9748,6 +10042,9 @@
     <w:next w:val="56"/>
     <w:qFormat/>
     <w:uiPriority w:val="0"/>
+    <w:pPr>
+      <w:spacing w:before="0" w:after="0" w:line="400" w:lineRule="exact"/>
+    </w:pPr>
   </w:style>
   <w:style w:type="paragraph" w:customStyle="1" w:styleId="224">
     <w:name w:val="标准文件_术语条二"/>
@@ -9755,6 +10052,9 @@
     <w:next w:val="56"/>
     <w:qFormat/>
     <w:uiPriority w:val="0"/>
+    <w:pPr>
+      <w:spacing w:before="0" w:after="0" w:line="400" w:lineRule="exact"/>
+    </w:pPr>
   </w:style>
   <w:style w:type="paragraph" w:customStyle="1" w:styleId="225">
     <w:name w:val="标准文件_术语条三"/>

</xml_diff>